<commit_message>
docs: update architecture usability tests
Co-authored-by: Copilot App <223556219+Copilot@users.noreply.github.com>
</commit_message>
<xml_diff>
--- a/docs/Documento-Piedra-azul-documento-arquitectura_corte1.docx
+++ b/docs/Documento-Piedra-azul-documento-arquitectura_corte1.docx
@@ -6202,6 +6202,950 @@
     </w:p>
     <w:p>
       <w:pPr>
+        <w:spacing w:after="80" w:lineRule="auto"/>
+      </w:pPr>
+      <w:r>
+        <w:rPr>
+          <w:rFonts w:ascii="Calibri" w:cs="Calibri" w:eastAsia="Calibri" w:hAnsi="Calibri"/>
+          <w:b w:val="1"/>
+          <w:bCs w:val="1"/>
+        </w:rPr>
+        <w:t xml:space="preserve">Interfaces implementadas</w:t>
+      </w:r>
+    </w:p>
+    <w:p>
+      <w:pPr>
+        <w:spacing w:after="120" w:lineRule="auto"/>
+      </w:pPr>
+      <w:r>
+        <w:rPr>
+          <w:rFonts w:ascii="Calibri" w:cs="Calibri" w:eastAsia="Calibri" w:hAnsi="Calibri"/>
+        </w:rPr>
+        <w:t xml:space="preserve">Las siguientes vistas corresponden al frontend ya construido en Vue 3 (repositorio, carpeta frontend/src/views). El acceso por rol se controla con las guardas del Vue Router. Frente a los prototipos, se agregó la vista de Pacientes y el panel de accesibilidad de texto (aumentar/disminuir tamaño) presente en todas las pantallas.</w:t>
+      </w:r>
+    </w:p>
+    <w:tbl>
+      <w:tblPr>
+        <w:tblW w:w="9025" w:type="dxa"/>
+        <w:tblBorders>
+          <w:top w:val="single" w:sz="4" w:space="0" w:color="000000"/>
+          <w:left w:val="single" w:sz="4" w:space="0" w:color="000000"/>
+          <w:bottom w:val="single" w:sz="4" w:space="0" w:color="000000"/>
+          <w:right w:val="single" w:sz="4" w:space="0" w:color="000000"/>
+          <w:insideH w:val="single" w:sz="4" w:space="0" w:color="000000"/>
+          <w:insideV w:val="single" w:sz="4" w:space="0" w:color="000000"/>
+        </w:tblBorders>
+        <w:tblLayout w:type="fixed"/>
+        <w:tblCellMar>
+          <w:left w:w="80" w:type="dxa"/>
+          <w:right w:w="80" w:type="dxa"/>
+        </w:tblCellMar>
+      </w:tblPr>
+      <w:tblGrid>
+        <w:gridCol w:w="1500"/>
+        <w:gridCol w:w="1250"/>
+        <w:gridCol w:w="1900"/>
+        <w:gridCol w:w="3175"/>
+        <w:gridCol w:w="1200"/>
+      </w:tblGrid>
+      <w:tr>
+        <w:trPr>
+          <w:tblHeader/>
+        </w:trPr>
+        <w:tc>
+          <w:tcPr>
+            <w:tcW w:w="1500" w:type="dxa"/>
+            <w:shd w:val="clear" w:color="auto" w:fill="D9E2F3"/>
+          </w:tcPr>
+          <w:p>
+            <w:pPr>
+              <w:spacing w:after="40" w:lineRule="auto"/>
+            </w:pPr>
+            <w:r>
+              <w:rPr>
+                <w:rFonts w:ascii="Calibri" w:cs="Calibri" w:eastAsia="Calibri" w:hAnsi="Calibri"/>
+                <w:b w:val="1"/>
+                <w:bCs w:val="1"/>
+                <w:sz w:val="18"/>
+                <w:szCs w:val="18"/>
+              </w:rPr>
+              <w:t xml:space="preserve">Vista</w:t>
+            </w:r>
+          </w:p>
+        </w:tc>
+        <w:tc>
+          <w:tcPr>
+            <w:tcW w:w="1250" w:type="dxa"/>
+            <w:shd w:val="clear" w:color="auto" w:fill="D9E2F3"/>
+          </w:tcPr>
+          <w:p>
+            <w:pPr>
+              <w:spacing w:after="40" w:lineRule="auto"/>
+            </w:pPr>
+            <w:r>
+              <w:rPr>
+                <w:rFonts w:ascii="Calibri" w:cs="Calibri" w:eastAsia="Calibri" w:hAnsi="Calibri"/>
+                <w:b w:val="1"/>
+                <w:bCs w:val="1"/>
+                <w:sz w:val="18"/>
+                <w:szCs w:val="18"/>
+              </w:rPr>
+              <w:t xml:space="preserve">Ruta</w:t>
+            </w:r>
+          </w:p>
+        </w:tc>
+        <w:tc>
+          <w:tcPr>
+            <w:tcW w:w="1900" w:type="dxa"/>
+            <w:shd w:val="clear" w:color="auto" w:fill="D9E2F3"/>
+          </w:tcPr>
+          <w:p>
+            <w:pPr>
+              <w:spacing w:after="40" w:lineRule="auto"/>
+            </w:pPr>
+            <w:r>
+              <w:rPr>
+                <w:rFonts w:ascii="Calibri" w:cs="Calibri" w:eastAsia="Calibri" w:hAnsi="Calibri"/>
+                <w:b w:val="1"/>
+                <w:bCs w:val="1"/>
+                <w:sz w:val="18"/>
+                <w:szCs w:val="18"/>
+              </w:rPr>
+              <w:t xml:space="preserve">Acceso (rol)</w:t>
+            </w:r>
+          </w:p>
+        </w:tc>
+        <w:tc>
+          <w:tcPr>
+            <w:tcW w:w="3175" w:type="dxa"/>
+            <w:shd w:val="clear" w:color="auto" w:fill="D9E2F3"/>
+          </w:tcPr>
+          <w:p>
+            <w:pPr>
+              <w:spacing w:after="40" w:lineRule="auto"/>
+            </w:pPr>
+            <w:r>
+              <w:rPr>
+                <w:rFonts w:ascii="Calibri" w:cs="Calibri" w:eastAsia="Calibri" w:hAnsi="Calibri"/>
+                <w:b w:val="1"/>
+                <w:bCs w:val="1"/>
+                <w:sz w:val="18"/>
+                <w:szCs w:val="18"/>
+              </w:rPr>
+              <w:t xml:space="preserve">Descripción</w:t>
+            </w:r>
+          </w:p>
+        </w:tc>
+        <w:tc>
+          <w:tcPr>
+            <w:tcW w:w="1200" w:type="dxa"/>
+            <w:shd w:val="clear" w:color="auto" w:fill="D9E2F3"/>
+          </w:tcPr>
+          <w:p>
+            <w:pPr>
+              <w:spacing w:after="40" w:lineRule="auto"/>
+            </w:pPr>
+            <w:r>
+              <w:rPr>
+                <w:rFonts w:ascii="Calibri" w:cs="Calibri" w:eastAsia="Calibri" w:hAnsi="Calibri"/>
+                <w:b w:val="1"/>
+                <w:bCs w:val="1"/>
+                <w:sz w:val="18"/>
+                <w:szCs w:val="18"/>
+              </w:rPr>
+              <w:t xml:space="preserve">Captura</w:t>
+            </w:r>
+          </w:p>
+        </w:tc>
+      </w:tr>
+      <w:tr>
+        <w:trPr>
+          <w:cantSplit/>
+        </w:trPr>
+        <w:tc>
+          <w:tcPr>
+            <w:tcW w:w="1500" w:type="dxa"/>
+          </w:tcPr>
+          <w:p>
+            <w:pPr>
+              <w:spacing w:after="40" w:lineRule="auto"/>
+            </w:pPr>
+            <w:r>
+              <w:rPr>
+                <w:rFonts w:ascii="Calibri" w:cs="Calibri" w:eastAsia="Calibri" w:hAnsi="Calibri"/>
+                <w:sz w:val="18"/>
+                <w:szCs w:val="18"/>
+              </w:rPr>
+              <w:t xml:space="preserve">Inicio (HomeView)</w:t>
+            </w:r>
+          </w:p>
+        </w:tc>
+        <w:tc>
+          <w:tcPr>
+            <w:tcW w:w="1250" w:type="dxa"/>
+          </w:tcPr>
+          <w:p>
+            <w:pPr>
+              <w:spacing w:after="40" w:lineRule="auto"/>
+            </w:pPr>
+            <w:r>
+              <w:rPr>
+                <w:rFonts w:ascii="Calibri" w:cs="Calibri" w:eastAsia="Calibri" w:hAnsi="Calibri"/>
+                <w:sz w:val="18"/>
+                <w:szCs w:val="18"/>
+              </w:rPr>
+              <w:t xml:space="preserve">/</w:t>
+            </w:r>
+          </w:p>
+        </w:tc>
+        <w:tc>
+          <w:tcPr>
+            <w:tcW w:w="1900" w:type="dxa"/>
+          </w:tcPr>
+          <w:p>
+            <w:pPr>
+              <w:spacing w:after="40" w:lineRule="auto"/>
+            </w:pPr>
+            <w:r>
+              <w:rPr>
+                <w:rFonts w:ascii="Calibri" w:cs="Calibri" w:eastAsia="Calibri" w:hAnsi="Calibri"/>
+                <w:sz w:val="18"/>
+                <w:szCs w:val="18"/>
+              </w:rPr>
+              <w:t xml:space="preserve">Público</w:t>
+            </w:r>
+          </w:p>
+        </w:tc>
+        <w:tc>
+          <w:tcPr>
+            <w:tcW w:w="3175" w:type="dxa"/>
+          </w:tcPr>
+          <w:p>
+            <w:pPr>
+              <w:spacing w:after="40" w:lineRule="auto"/>
+            </w:pPr>
+            <w:r>
+              <w:rPr>
+                <w:rFonts w:ascii="Calibri" w:cs="Calibri" w:eastAsia="Calibri" w:hAnsi="Calibri"/>
+                <w:sz w:val="18"/>
+                <w:szCs w:val="18"/>
+              </w:rPr>
+              <w:t xml:space="preserve">Página de bienvenida al Sistema de Gestión de Citas Médicas.</w:t>
+            </w:r>
+          </w:p>
+        </w:tc>
+        <w:tc>
+          <w:tcPr>
+            <w:tcW w:w="1200" w:type="dxa"/>
+          </w:tcPr>
+          <w:p>
+            <w:pPr>
+              <w:spacing w:after="40" w:lineRule="auto"/>
+            </w:pPr>
+            <w:r>
+              <w:rPr>
+                <w:rFonts w:ascii="Calibri" w:cs="Calibri" w:eastAsia="Calibri" w:hAnsi="Calibri"/>
+                <w:sz w:val="18"/>
+                <w:szCs w:val="18"/>
+              </w:rPr>
+              <w:t xml:space="preserve">[Pegar captura]</w:t>
+            </w:r>
+          </w:p>
+        </w:tc>
+      </w:tr>
+      <w:tr>
+        <w:trPr>
+          <w:cantSplit/>
+        </w:trPr>
+        <w:tc>
+          <w:tcPr>
+            <w:tcW w:w="1500" w:type="dxa"/>
+          </w:tcPr>
+          <w:p>
+            <w:pPr>
+              <w:spacing w:after="40" w:lineRule="auto"/>
+            </w:pPr>
+            <w:r>
+              <w:rPr>
+                <w:rFonts w:ascii="Calibri" w:cs="Calibri" w:eastAsia="Calibri" w:hAnsi="Calibri"/>
+                <w:sz w:val="18"/>
+                <w:szCs w:val="18"/>
+              </w:rPr>
+              <w:t xml:space="preserve">Iniciar sesión (LoginView)</w:t>
+            </w:r>
+          </w:p>
+        </w:tc>
+        <w:tc>
+          <w:tcPr>
+            <w:tcW w:w="1250" w:type="dxa"/>
+          </w:tcPr>
+          <w:p>
+            <w:pPr>
+              <w:spacing w:after="40" w:lineRule="auto"/>
+            </w:pPr>
+            <w:r>
+              <w:rPr>
+                <w:rFonts w:ascii="Calibri" w:cs="Calibri" w:eastAsia="Calibri" w:hAnsi="Calibri"/>
+                <w:sz w:val="18"/>
+                <w:szCs w:val="18"/>
+              </w:rPr>
+              <w:t xml:space="preserve">/login</w:t>
+            </w:r>
+          </w:p>
+        </w:tc>
+        <w:tc>
+          <w:tcPr>
+            <w:tcW w:w="1900" w:type="dxa"/>
+          </w:tcPr>
+          <w:p>
+            <w:pPr>
+              <w:spacing w:after="40" w:lineRule="auto"/>
+            </w:pPr>
+            <w:r>
+              <w:rPr>
+                <w:rFonts w:ascii="Calibri" w:cs="Calibri" w:eastAsia="Calibri" w:hAnsi="Calibri"/>
+                <w:sz w:val="18"/>
+                <w:szCs w:val="18"/>
+              </w:rPr>
+              <w:t xml:space="preserve">Invitados (sin sesión)</w:t>
+            </w:r>
+          </w:p>
+        </w:tc>
+        <w:tc>
+          <w:tcPr>
+            <w:tcW w:w="3175" w:type="dxa"/>
+          </w:tcPr>
+          <w:p>
+            <w:pPr>
+              <w:spacing w:after="40" w:lineRule="auto"/>
+            </w:pPr>
+            <w:r>
+              <w:rPr>
+                <w:rFonts w:ascii="Calibri" w:cs="Calibri" w:eastAsia="Calibri" w:hAnsi="Calibri"/>
+                <w:sz w:val="18"/>
+                <w:szCs w:val="18"/>
+              </w:rPr>
+              <w:t xml:space="preserve">Formulario de usuario y contraseña; al autenticarse guarda el token JWT y redirige.</w:t>
+            </w:r>
+          </w:p>
+        </w:tc>
+        <w:tc>
+          <w:tcPr>
+            <w:tcW w:w="1200" w:type="dxa"/>
+          </w:tcPr>
+          <w:p>
+            <w:pPr>
+              <w:spacing w:after="40" w:lineRule="auto"/>
+            </w:pPr>
+            <w:r>
+              <w:rPr>
+                <w:rFonts w:ascii="Calibri" w:cs="Calibri" w:eastAsia="Calibri" w:hAnsi="Calibri"/>
+                <w:sz w:val="18"/>
+                <w:szCs w:val="18"/>
+              </w:rPr>
+              <w:t xml:space="preserve">[Pegar captura]</w:t>
+            </w:r>
+          </w:p>
+        </w:tc>
+      </w:tr>
+      <w:tr>
+        <w:trPr>
+          <w:cantSplit/>
+        </w:trPr>
+        <w:tc>
+          <w:tcPr>
+            <w:tcW w:w="1500" w:type="dxa"/>
+          </w:tcPr>
+          <w:p>
+            <w:pPr>
+              <w:spacing w:after="40" w:lineRule="auto"/>
+            </w:pPr>
+            <w:r>
+              <w:rPr>
+                <w:rFonts w:ascii="Calibri" w:cs="Calibri" w:eastAsia="Calibri" w:hAnsi="Calibri"/>
+                <w:sz w:val="18"/>
+                <w:szCs w:val="18"/>
+              </w:rPr>
+              <w:t xml:space="preserve">Crear cuenta (RegisterView)</w:t>
+            </w:r>
+          </w:p>
+        </w:tc>
+        <w:tc>
+          <w:tcPr>
+            <w:tcW w:w="1250" w:type="dxa"/>
+          </w:tcPr>
+          <w:p>
+            <w:pPr>
+              <w:spacing w:after="40" w:lineRule="auto"/>
+            </w:pPr>
+            <w:r>
+              <w:rPr>
+                <w:rFonts w:ascii="Calibri" w:cs="Calibri" w:eastAsia="Calibri" w:hAnsi="Calibri"/>
+                <w:sz w:val="18"/>
+                <w:szCs w:val="18"/>
+              </w:rPr>
+              <w:t xml:space="preserve">/register</w:t>
+            </w:r>
+          </w:p>
+        </w:tc>
+        <w:tc>
+          <w:tcPr>
+            <w:tcW w:w="1900" w:type="dxa"/>
+          </w:tcPr>
+          <w:p>
+            <w:pPr>
+              <w:spacing w:after="40" w:lineRule="auto"/>
+            </w:pPr>
+            <w:r>
+              <w:rPr>
+                <w:rFonts w:ascii="Calibri" w:cs="Calibri" w:eastAsia="Calibri" w:hAnsi="Calibri"/>
+                <w:sz w:val="18"/>
+                <w:szCs w:val="18"/>
+              </w:rPr>
+              <w:t xml:space="preserve">Invitados (sin sesión)</w:t>
+            </w:r>
+          </w:p>
+        </w:tc>
+        <w:tc>
+          <w:tcPr>
+            <w:tcW w:w="3175" w:type="dxa"/>
+          </w:tcPr>
+          <w:p>
+            <w:pPr>
+              <w:spacing w:after="40" w:lineRule="auto"/>
+            </w:pPr>
+            <w:r>
+              <w:rPr>
+                <w:rFonts w:ascii="Calibri" w:cs="Calibri" w:eastAsia="Calibri" w:hAnsi="Calibri"/>
+                <w:sz w:val="18"/>
+                <w:szCs w:val="18"/>
+              </w:rPr>
+              <w:t xml:space="preserve">Registro de paciente: nombre completo, correo, usuario y contraseña.</w:t>
+            </w:r>
+          </w:p>
+        </w:tc>
+        <w:tc>
+          <w:tcPr>
+            <w:tcW w:w="1200" w:type="dxa"/>
+          </w:tcPr>
+          <w:p>
+            <w:pPr>
+              <w:spacing w:after="40" w:lineRule="auto"/>
+            </w:pPr>
+            <w:r>
+              <w:rPr>
+                <w:rFonts w:ascii="Calibri" w:cs="Calibri" w:eastAsia="Calibri" w:hAnsi="Calibri"/>
+                <w:sz w:val="18"/>
+                <w:szCs w:val="18"/>
+              </w:rPr>
+              <w:t xml:space="preserve">[Pegar captura]</w:t>
+            </w:r>
+          </w:p>
+        </w:tc>
+      </w:tr>
+      <w:tr>
+        <w:trPr>
+          <w:cantSplit/>
+        </w:trPr>
+        <w:tc>
+          <w:tcPr>
+            <w:tcW w:w="1500" w:type="dxa"/>
+          </w:tcPr>
+          <w:p>
+            <w:pPr>
+              <w:spacing w:after="40" w:lineRule="auto"/>
+            </w:pPr>
+            <w:r>
+              <w:rPr>
+                <w:rFonts w:ascii="Calibri" w:cs="Calibri" w:eastAsia="Calibri" w:hAnsi="Calibri"/>
+                <w:sz w:val="18"/>
+                <w:szCs w:val="18"/>
+              </w:rPr>
+              <w:t xml:space="preserve">Especialidades (SpecialtiesView)</w:t>
+            </w:r>
+          </w:p>
+        </w:tc>
+        <w:tc>
+          <w:tcPr>
+            <w:tcW w:w="1250" w:type="dxa"/>
+          </w:tcPr>
+          <w:p>
+            <w:pPr>
+              <w:spacing w:after="40" w:lineRule="auto"/>
+            </w:pPr>
+            <w:r>
+              <w:rPr>
+                <w:rFonts w:ascii="Calibri" w:cs="Calibri" w:eastAsia="Calibri" w:hAnsi="Calibri"/>
+                <w:sz w:val="18"/>
+                <w:szCs w:val="18"/>
+              </w:rPr>
+              <w:t xml:space="preserve">/specialties</w:t>
+            </w:r>
+          </w:p>
+        </w:tc>
+        <w:tc>
+          <w:tcPr>
+            <w:tcW w:w="1900" w:type="dxa"/>
+          </w:tcPr>
+          <w:p>
+            <w:pPr>
+              <w:spacing w:after="40" w:lineRule="auto"/>
+            </w:pPr>
+            <w:r>
+              <w:rPr>
+                <w:rFonts w:ascii="Calibri" w:cs="Calibri" w:eastAsia="Calibri" w:hAnsi="Calibri"/>
+                <w:sz w:val="18"/>
+                <w:szCs w:val="18"/>
+              </w:rPr>
+              <w:t xml:space="preserve">ADMIN, SCHEDULER</w:t>
+            </w:r>
+          </w:p>
+        </w:tc>
+        <w:tc>
+          <w:tcPr>
+            <w:tcW w:w="3175" w:type="dxa"/>
+          </w:tcPr>
+          <w:p>
+            <w:pPr>
+              <w:spacing w:after="40" w:lineRule="auto"/>
+            </w:pPr>
+            <w:r>
+              <w:rPr>
+                <w:rFonts w:ascii="Calibri" w:cs="Calibri" w:eastAsia="Calibri" w:hAnsi="Calibri"/>
+                <w:sz w:val="18"/>
+                <w:szCs w:val="18"/>
+              </w:rPr>
+              <w:t xml:space="preserve">Formulario para crear especialidades y tabla de especialidades registradas.</w:t>
+            </w:r>
+          </w:p>
+        </w:tc>
+        <w:tc>
+          <w:tcPr>
+            <w:tcW w:w="1200" w:type="dxa"/>
+          </w:tcPr>
+          <w:p>
+            <w:pPr>
+              <w:spacing w:after="40" w:lineRule="auto"/>
+            </w:pPr>
+            <w:r>
+              <w:rPr>
+                <w:rFonts w:ascii="Calibri" w:cs="Calibri" w:eastAsia="Calibri" w:hAnsi="Calibri"/>
+                <w:sz w:val="18"/>
+                <w:szCs w:val="18"/>
+              </w:rPr>
+              <w:t xml:space="preserve">[Pegar captura]</w:t>
+            </w:r>
+          </w:p>
+        </w:tc>
+      </w:tr>
+      <w:tr>
+        <w:trPr>
+          <w:cantSplit/>
+        </w:trPr>
+        <w:tc>
+          <w:tcPr>
+            <w:tcW w:w="1500" w:type="dxa"/>
+          </w:tcPr>
+          <w:p>
+            <w:pPr>
+              <w:spacing w:after="40" w:lineRule="auto"/>
+            </w:pPr>
+            <w:r>
+              <w:rPr>
+                <w:rFonts w:ascii="Calibri" w:cs="Calibri" w:eastAsia="Calibri" w:hAnsi="Calibri"/>
+                <w:sz w:val="18"/>
+                <w:szCs w:val="18"/>
+              </w:rPr>
+              <w:t xml:space="preserve">Profesionales (ProfessionalsView)</w:t>
+            </w:r>
+          </w:p>
+        </w:tc>
+        <w:tc>
+          <w:tcPr>
+            <w:tcW w:w="1250" w:type="dxa"/>
+          </w:tcPr>
+          <w:p>
+            <w:pPr>
+              <w:spacing w:after="40" w:lineRule="auto"/>
+            </w:pPr>
+            <w:r>
+              <w:rPr>
+                <w:rFonts w:ascii="Calibri" w:cs="Calibri" w:eastAsia="Calibri" w:hAnsi="Calibri"/>
+                <w:sz w:val="18"/>
+                <w:szCs w:val="18"/>
+              </w:rPr>
+              <w:t xml:space="preserve">/professionals</w:t>
+            </w:r>
+          </w:p>
+        </w:tc>
+        <w:tc>
+          <w:tcPr>
+            <w:tcW w:w="1900" w:type="dxa"/>
+          </w:tcPr>
+          <w:p>
+            <w:pPr>
+              <w:spacing w:after="40" w:lineRule="auto"/>
+            </w:pPr>
+            <w:r>
+              <w:rPr>
+                <w:rFonts w:ascii="Calibri" w:cs="Calibri" w:eastAsia="Calibri" w:hAnsi="Calibri"/>
+                <w:sz w:val="18"/>
+                <w:szCs w:val="18"/>
+              </w:rPr>
+              <w:t xml:space="preserve">ADMIN, SCHEDULER</w:t>
+            </w:r>
+          </w:p>
+        </w:tc>
+        <w:tc>
+          <w:tcPr>
+            <w:tcW w:w="3175" w:type="dxa"/>
+          </w:tcPr>
+          <w:p>
+            <w:pPr>
+              <w:spacing w:after="40" w:lineRule="auto"/>
+            </w:pPr>
+            <w:r>
+              <w:rPr>
+                <w:rFonts w:ascii="Calibri" w:cs="Calibri" w:eastAsia="Calibri" w:hAnsi="Calibri"/>
+                <w:sz w:val="18"/>
+                <w:szCs w:val="18"/>
+              </w:rPr>
+              <w:t xml:space="preserve">Registro de profesional (usuario, especialidad, tipo y duración de cita en minutos) y listado de activos.</w:t>
+            </w:r>
+          </w:p>
+        </w:tc>
+        <w:tc>
+          <w:tcPr>
+            <w:tcW w:w="1200" w:type="dxa"/>
+          </w:tcPr>
+          <w:p>
+            <w:pPr>
+              <w:spacing w:after="40" w:lineRule="auto"/>
+            </w:pPr>
+            <w:r>
+              <w:rPr>
+                <w:rFonts w:ascii="Calibri" w:cs="Calibri" w:eastAsia="Calibri" w:hAnsi="Calibri"/>
+                <w:sz w:val="18"/>
+                <w:szCs w:val="18"/>
+              </w:rPr>
+              <w:t xml:space="preserve">[Pegar captura]</w:t>
+            </w:r>
+          </w:p>
+        </w:tc>
+      </w:tr>
+      <w:tr>
+        <w:trPr>
+          <w:cantSplit/>
+        </w:trPr>
+        <w:tc>
+          <w:tcPr>
+            <w:tcW w:w="1500" w:type="dxa"/>
+          </w:tcPr>
+          <w:p>
+            <w:pPr>
+              <w:spacing w:after="40" w:lineRule="auto"/>
+            </w:pPr>
+            <w:r>
+              <w:rPr>
+                <w:rFonts w:ascii="Calibri" w:cs="Calibri" w:eastAsia="Calibri" w:hAnsi="Calibri"/>
+                <w:sz w:val="18"/>
+                <w:szCs w:val="18"/>
+              </w:rPr>
+              <w:t xml:space="preserve">Disponibilidad y horarios (SchedulingView)</w:t>
+            </w:r>
+          </w:p>
+        </w:tc>
+        <w:tc>
+          <w:tcPr>
+            <w:tcW w:w="1250" w:type="dxa"/>
+          </w:tcPr>
+          <w:p>
+            <w:pPr>
+              <w:spacing w:after="40" w:lineRule="auto"/>
+            </w:pPr>
+            <w:r>
+              <w:rPr>
+                <w:rFonts w:ascii="Calibri" w:cs="Calibri" w:eastAsia="Calibri" w:hAnsi="Calibri"/>
+                <w:sz w:val="18"/>
+                <w:szCs w:val="18"/>
+              </w:rPr>
+              <w:t xml:space="preserve">/scheduling</w:t>
+            </w:r>
+          </w:p>
+        </w:tc>
+        <w:tc>
+          <w:tcPr>
+            <w:tcW w:w="1900" w:type="dxa"/>
+          </w:tcPr>
+          <w:p>
+            <w:pPr>
+              <w:spacing w:after="40" w:lineRule="auto"/>
+            </w:pPr>
+            <w:r>
+              <w:rPr>
+                <w:rFonts w:ascii="Calibri" w:cs="Calibri" w:eastAsia="Calibri" w:hAnsi="Calibri"/>
+                <w:sz w:val="18"/>
+                <w:szCs w:val="18"/>
+              </w:rPr>
+              <w:t xml:space="preserve">ADMIN, SCHEDULER, PROFESSIONAL</w:t>
+            </w:r>
+          </w:p>
+        </w:tc>
+        <w:tc>
+          <w:tcPr>
+            <w:tcW w:w="3175" w:type="dxa"/>
+          </w:tcPr>
+          <w:p>
+            <w:pPr>
+              <w:spacing w:after="40" w:lineRule="auto"/>
+            </w:pPr>
+            <w:r>
+              <w:rPr>
+                <w:rFonts w:ascii="Calibri" w:cs="Calibri" w:eastAsia="Calibri" w:hAnsi="Calibri"/>
+                <w:sz w:val="18"/>
+                <w:szCs w:val="18"/>
+              </w:rPr>
+              <w:t xml:space="preserve">Registro del horario semanal por profesional y consulta de franjas horarias libres por fecha.</w:t>
+            </w:r>
+          </w:p>
+        </w:tc>
+        <w:tc>
+          <w:tcPr>
+            <w:tcW w:w="1200" w:type="dxa"/>
+          </w:tcPr>
+          <w:p>
+            <w:pPr>
+              <w:spacing w:after="40" w:lineRule="auto"/>
+            </w:pPr>
+            <w:r>
+              <w:rPr>
+                <w:rFonts w:ascii="Calibri" w:cs="Calibri" w:eastAsia="Calibri" w:hAnsi="Calibri"/>
+                <w:sz w:val="18"/>
+                <w:szCs w:val="18"/>
+              </w:rPr>
+              <w:t xml:space="preserve">[Pegar captura]</w:t>
+            </w:r>
+          </w:p>
+        </w:tc>
+      </w:tr>
+      <w:tr>
+        <w:trPr>
+          <w:cantSplit/>
+        </w:trPr>
+        <w:tc>
+          <w:tcPr>
+            <w:tcW w:w="1500" w:type="dxa"/>
+          </w:tcPr>
+          <w:p>
+            <w:pPr>
+              <w:spacing w:after="40" w:lineRule="auto"/>
+            </w:pPr>
+            <w:r>
+              <w:rPr>
+                <w:rFonts w:ascii="Calibri" w:cs="Calibri" w:eastAsia="Calibri" w:hAnsi="Calibri"/>
+                <w:sz w:val="18"/>
+                <w:szCs w:val="18"/>
+              </w:rPr>
+              <w:t xml:space="preserve">Citas médicas (AppointmentsView)</w:t>
+            </w:r>
+          </w:p>
+        </w:tc>
+        <w:tc>
+          <w:tcPr>
+            <w:tcW w:w="1250" w:type="dxa"/>
+          </w:tcPr>
+          <w:p>
+            <w:pPr>
+              <w:spacing w:after="40" w:lineRule="auto"/>
+            </w:pPr>
+            <w:r>
+              <w:rPr>
+                <w:rFonts w:ascii="Calibri" w:cs="Calibri" w:eastAsia="Calibri" w:hAnsi="Calibri"/>
+                <w:sz w:val="18"/>
+                <w:szCs w:val="18"/>
+              </w:rPr>
+              <w:t xml:space="preserve">/appointments</w:t>
+            </w:r>
+          </w:p>
+        </w:tc>
+        <w:tc>
+          <w:tcPr>
+            <w:tcW w:w="1900" w:type="dxa"/>
+          </w:tcPr>
+          <w:p>
+            <w:pPr>
+              <w:spacing w:after="40" w:lineRule="auto"/>
+            </w:pPr>
+            <w:r>
+              <w:rPr>
+                <w:rFonts w:ascii="Calibri" w:cs="Calibri" w:eastAsia="Calibri" w:hAnsi="Calibri"/>
+                <w:sz w:val="18"/>
+                <w:szCs w:val="18"/>
+              </w:rPr>
+              <w:t xml:space="preserve">Cualquier usuario autenticado</w:t>
+            </w:r>
+          </w:p>
+        </w:tc>
+        <w:tc>
+          <w:tcPr>
+            <w:tcW w:w="3175" w:type="dxa"/>
+          </w:tcPr>
+          <w:p>
+            <w:pPr>
+              <w:spacing w:after="40" w:lineRule="auto"/>
+            </w:pPr>
+            <w:r>
+              <w:rPr>
+                <w:rFonts w:ascii="Calibri" w:cs="Calibri" w:eastAsia="Calibri" w:hAnsi="Calibri"/>
+                <w:sz w:val="18"/>
+                <w:szCs w:val="18"/>
+              </w:rPr>
+              <w:t xml:space="preserve">Agendar una cita (profesional, fecha y franja) y consultar/filtrar citas por profesional y fecha.</w:t>
+            </w:r>
+          </w:p>
+        </w:tc>
+        <w:tc>
+          <w:tcPr>
+            <w:tcW w:w="1200" w:type="dxa"/>
+          </w:tcPr>
+          <w:p>
+            <w:pPr>
+              <w:spacing w:after="40" w:lineRule="auto"/>
+            </w:pPr>
+            <w:r>
+              <w:rPr>
+                <w:rFonts w:ascii="Calibri" w:cs="Calibri" w:eastAsia="Calibri" w:hAnsi="Calibri"/>
+                <w:sz w:val="18"/>
+                <w:szCs w:val="18"/>
+              </w:rPr>
+              <w:t xml:space="preserve">[Pegar captura]</w:t>
+            </w:r>
+          </w:p>
+        </w:tc>
+      </w:tr>
+      <w:tr>
+        <w:trPr>
+          <w:cantSplit/>
+        </w:trPr>
+        <w:tc>
+          <w:tcPr>
+            <w:tcW w:w="1500" w:type="dxa"/>
+          </w:tcPr>
+          <w:p>
+            <w:pPr>
+              <w:spacing w:after="40" w:lineRule="auto"/>
+            </w:pPr>
+            <w:r>
+              <w:rPr>
+                <w:rFonts w:ascii="Calibri" w:cs="Calibri" w:eastAsia="Calibri" w:hAnsi="Calibri"/>
+                <w:sz w:val="18"/>
+                <w:szCs w:val="18"/>
+              </w:rPr>
+              <w:t xml:space="preserve">Pacientes (PatientsView)</w:t>
+            </w:r>
+          </w:p>
+        </w:tc>
+        <w:tc>
+          <w:tcPr>
+            <w:tcW w:w="1250" w:type="dxa"/>
+          </w:tcPr>
+          <w:p>
+            <w:pPr>
+              <w:spacing w:after="40" w:lineRule="auto"/>
+            </w:pPr>
+            <w:r>
+              <w:rPr>
+                <w:rFonts w:ascii="Calibri" w:cs="Calibri" w:eastAsia="Calibri" w:hAnsi="Calibri"/>
+                <w:sz w:val="18"/>
+                <w:szCs w:val="18"/>
+              </w:rPr>
+              <w:t xml:space="preserve">/patients</w:t>
+            </w:r>
+          </w:p>
+        </w:tc>
+        <w:tc>
+          <w:tcPr>
+            <w:tcW w:w="1900" w:type="dxa"/>
+          </w:tcPr>
+          <w:p>
+            <w:pPr>
+              <w:spacing w:after="40" w:lineRule="auto"/>
+            </w:pPr>
+            <w:r>
+              <w:rPr>
+                <w:rFonts w:ascii="Calibri" w:cs="Calibri" w:eastAsia="Calibri" w:hAnsi="Calibri"/>
+                <w:sz w:val="18"/>
+                <w:szCs w:val="18"/>
+              </w:rPr>
+              <w:t xml:space="preserve">PROFESSIONAL, MEDICO, ADMIN</w:t>
+            </w:r>
+          </w:p>
+        </w:tc>
+        <w:tc>
+          <w:tcPr>
+            <w:tcW w:w="3175" w:type="dxa"/>
+          </w:tcPr>
+          <w:p>
+            <w:pPr>
+              <w:spacing w:after="40" w:lineRule="auto"/>
+            </w:pPr>
+            <w:r>
+              <w:rPr>
+                <w:rFonts w:ascii="Calibri" w:cs="Calibri" w:eastAsia="Calibri" w:hAnsi="Calibri"/>
+                <w:sz w:val="18"/>
+                <w:szCs w:val="18"/>
+              </w:rPr>
+              <w:t xml:space="preserve">Registro, edición y búsqueda de pacientes (documento, teléfono, fecha de nacimiento).</w:t>
+            </w:r>
+          </w:p>
+        </w:tc>
+        <w:tc>
+          <w:tcPr>
+            <w:tcW w:w="1200" w:type="dxa"/>
+          </w:tcPr>
+          <w:p>
+            <w:pPr>
+              <w:spacing w:after="40" w:lineRule="auto"/>
+            </w:pPr>
+            <w:r>
+              <w:rPr>
+                <w:rFonts w:ascii="Calibri" w:cs="Calibri" w:eastAsia="Calibri" w:hAnsi="Calibri"/>
+                <w:sz w:val="18"/>
+                <w:szCs w:val="18"/>
+              </w:rPr>
+              <w:t xml:space="preserve">[Pegar captura]</w:t>
+            </w:r>
+          </w:p>
+        </w:tc>
+      </w:tr>
+    </w:tbl>
+    <w:p>
+      <w:pPr>
+        <w:spacing w:after="120" w:lineRule="auto"/>
+      </w:pPr>
+      <w:r>
+        <w:rPr>
+          <w:rFonts w:ascii="Calibri" w:cs="Calibri" w:eastAsia="Calibri" w:hAnsi="Calibri"/>
+        </w:rPr>
+        <w:t xml:space="preserve"/>
+      </w:r>
+    </w:p>
+    <w:p>
+      <w:pPr>
+        <w:spacing w:after="200" w:lineRule="auto"/>
+      </w:pPr>
+      <w:r>
+        <w:rPr>
+          <w:rFonts w:ascii="Calibri" w:cs="Calibri" w:eastAsia="Calibri" w:hAnsi="Calibri"/>
+          <w:i w:val="1"/>
+          <w:iCs w:val="1"/>
+          <w:color w:val="B45309"/>
+        </w:rPr>
+        <w:t xml:space="preserve">Nota: reemplazar cada marcador "[Pegar captura]" por la captura de pantalla de la vista en ejecución.</w:t>
+      </w:r>
+    </w:p>
+    <w:p>
+      <w:pPr>
         <w:pStyle w:val="Heading2"/>
         <w:rPr/>
       </w:pPr>
@@ -6212,6 +7156,1849 @@
           <w:rtl w:val="0"/>
         </w:rPr>
         <w:t xml:space="preserve">Test de usabilidad</w:t>
+      </w:r>
+    </w:p>
+    <w:p>
+      <w:pPr>
+        <w:spacing w:after="120" w:lineRule="auto"/>
+      </w:pPr>
+      <w:r>
+        <w:rPr>
+          <w:rFonts w:ascii="Calibri" w:cs="Calibri" w:eastAsia="Calibri" w:hAnsi="Calibri"/>
+          <w:i w:val="1"/>
+          <w:iCs w:val="1"/>
+          <w:color w:val="B45309"/>
+        </w:rPr>
+        <w:t xml:space="preserve">Estado: plan de la prueba definido; la ejecución con usuarios y el registro de resultados están pendientes.</w:t>
+      </w:r>
+    </w:p>
+    <w:p>
+      <w:pPr>
+        <w:spacing w:after="60" w:lineRule="auto"/>
+      </w:pPr>
+      <w:r>
+        <w:rPr>
+          <w:rFonts w:ascii="Calibri" w:cs="Calibri" w:eastAsia="Calibri" w:hAnsi="Calibri"/>
+          <w:b w:val="1"/>
+          <w:bCs w:val="1"/>
+        </w:rPr>
+        <w:t xml:space="preserve">Objetivo</w:t>
+      </w:r>
+    </w:p>
+    <w:p>
+      <w:pPr>
+        <w:spacing w:after="120" w:lineRule="auto"/>
+      </w:pPr>
+      <w:r>
+        <w:rPr>
+          <w:rFonts w:ascii="Calibri" w:cs="Calibri" w:eastAsia="Calibri" w:hAnsi="Calibri"/>
+        </w:rPr>
+        <w:t xml:space="preserve">Evaluar qué tan fácil, eficiente y comprensible resulta la aplicación web Piedra Azul para sus usuarios reales, y verificar los escenarios de calidad de usabilidad definidos en la sección 5 (ajuste de tamaño de texto y mensajes de error claros).</w:t>
+      </w:r>
+    </w:p>
+    <w:p>
+      <w:pPr>
+        <w:spacing w:after="60" w:lineRule="auto"/>
+      </w:pPr>
+      <w:r>
+        <w:rPr>
+          <w:rFonts w:ascii="Calibri" w:cs="Calibri" w:eastAsia="Calibri" w:hAnsi="Calibri"/>
+          <w:b w:val="1"/>
+          <w:bCs w:val="1"/>
+        </w:rPr>
+        <w:t xml:space="preserve">Metodología</w:t>
+      </w:r>
+    </w:p>
+    <w:p>
+      <w:pPr>
+        <w:spacing w:after="60" w:lineRule="auto"/>
+        <w:ind w:left="500" w:hanging="250"/>
+      </w:pPr>
+      <w:r>
+        <w:rPr>
+          <w:rFonts w:ascii="Calibri" w:cs="Calibri" w:eastAsia="Calibri" w:hAnsi="Calibri"/>
+        </w:rPr>
+        <w:t xml:space="preserve">•  Prueba moderada con usuarios, tomando como referencia 5 participantes: 2 pacientes sin experiencia técnica, 1 agendador, 1 profesional de la salud y 1 administrador.</w:t>
+      </w:r>
+    </w:p>
+    <w:p>
+      <w:pPr>
+        <w:spacing w:after="60" w:lineRule="auto"/>
+        <w:ind w:left="500" w:hanging="250"/>
+      </w:pPr>
+      <w:r>
+        <w:rPr>
+          <w:rFonts w:ascii="Calibri" w:cs="Calibri" w:eastAsia="Calibri" w:hAnsi="Calibri"/>
+        </w:rPr>
+        <w:t xml:space="preserve">•  Cada participante ejecuta las tareas sobre la aplicación en funcionamiento, sin ayuda, mientras un observador registra tiempos, errores y comentarios.</w:t>
+      </w:r>
+    </w:p>
+    <w:p>
+      <w:pPr>
+        <w:spacing w:after="60" w:lineRule="auto"/>
+        <w:ind w:left="500" w:hanging="250"/>
+      </w:pPr>
+      <w:r>
+        <w:rPr>
+          <w:rFonts w:ascii="Calibri" w:cs="Calibri" w:eastAsia="Calibri" w:hAnsi="Calibri"/>
+        </w:rPr>
+        <w:t xml:space="preserve">•  Al finalizar, cada participante califica la facilidad de uso de 1 (muy difícil) a 5 (muy fácil) y comenta qué cambiaría.</w:t>
+      </w:r>
+    </w:p>
+    <w:p>
+      <w:pPr>
+        <w:spacing w:after="60" w:lineRule="auto"/>
+      </w:pPr>
+      <w:r>
+        <w:rPr>
+          <w:rFonts w:ascii="Calibri" w:cs="Calibri" w:eastAsia="Calibri" w:hAnsi="Calibri"/>
+        </w:rPr>
+        <w:t xml:space="preserve"/>
+      </w:r>
+    </w:p>
+    <w:p>
+      <w:pPr>
+        <w:spacing w:after="60" w:lineRule="auto"/>
+      </w:pPr>
+      <w:r>
+        <w:rPr>
+          <w:rFonts w:ascii="Calibri" w:cs="Calibri" w:eastAsia="Calibri" w:hAnsi="Calibri"/>
+          <w:b w:val="1"/>
+          <w:bCs w:val="1"/>
+        </w:rPr>
+        <w:t xml:space="preserve">Tareas a evaluar</w:t>
+      </w:r>
+    </w:p>
+    <w:tbl>
+      <w:tblPr>
+        <w:tblW w:w="9025" w:type="dxa"/>
+        <w:tblBorders>
+          <w:top w:val="single" w:sz="4" w:space="0" w:color="000000"/>
+          <w:left w:val="single" w:sz="4" w:space="0" w:color="000000"/>
+          <w:bottom w:val="single" w:sz="4" w:space="0" w:color="000000"/>
+          <w:right w:val="single" w:sz="4" w:space="0" w:color="000000"/>
+          <w:insideH w:val="single" w:sz="4" w:space="0" w:color="000000"/>
+          <w:insideV w:val="single" w:sz="4" w:space="0" w:color="000000"/>
+        </w:tblBorders>
+        <w:tblLayout w:type="fixed"/>
+        <w:tblCellMar>
+          <w:left w:w="80" w:type="dxa"/>
+          <w:right w:w="80" w:type="dxa"/>
+        </w:tblCellMar>
+      </w:tblPr>
+      <w:tblGrid>
+        <w:gridCol w:w="700"/>
+        <w:gridCol w:w="4300"/>
+        <w:gridCol w:w="2000"/>
+        <w:gridCol w:w="2025"/>
+      </w:tblGrid>
+      <w:tr>
+        <w:trPr>
+          <w:tblHeader/>
+        </w:trPr>
+        <w:tc>
+          <w:tcPr>
+            <w:tcW w:w="700" w:type="dxa"/>
+            <w:shd w:val="clear" w:color="auto" w:fill="D9E2F3"/>
+          </w:tcPr>
+          <w:p>
+            <w:pPr>
+              <w:spacing w:after="40" w:lineRule="auto"/>
+            </w:pPr>
+            <w:r>
+              <w:rPr>
+                <w:rFonts w:ascii="Calibri" w:cs="Calibri" w:eastAsia="Calibri" w:hAnsi="Calibri"/>
+                <w:b w:val="1"/>
+                <w:bCs w:val="1"/>
+                <w:sz w:val="18"/>
+                <w:szCs w:val="18"/>
+              </w:rPr>
+              <w:t xml:space="preserve">ID</w:t>
+            </w:r>
+          </w:p>
+        </w:tc>
+        <w:tc>
+          <w:tcPr>
+            <w:tcW w:w="4300" w:type="dxa"/>
+            <w:shd w:val="clear" w:color="auto" w:fill="D9E2F3"/>
+          </w:tcPr>
+          <w:p>
+            <w:pPr>
+              <w:spacing w:after="40" w:lineRule="auto"/>
+            </w:pPr>
+            <w:r>
+              <w:rPr>
+                <w:rFonts w:ascii="Calibri" w:cs="Calibri" w:eastAsia="Calibri" w:hAnsi="Calibri"/>
+                <w:b w:val="1"/>
+                <w:bCs w:val="1"/>
+                <w:sz w:val="18"/>
+                <w:szCs w:val="18"/>
+              </w:rPr>
+              <w:t xml:space="preserve">Tarea</w:t>
+            </w:r>
+          </w:p>
+        </w:tc>
+        <w:tc>
+          <w:tcPr>
+            <w:tcW w:w="2000" w:type="dxa"/>
+            <w:shd w:val="clear" w:color="auto" w:fill="D9E2F3"/>
+          </w:tcPr>
+          <w:p>
+            <w:pPr>
+              <w:spacing w:after="40" w:lineRule="auto"/>
+            </w:pPr>
+            <w:r>
+              <w:rPr>
+                <w:rFonts w:ascii="Calibri" w:cs="Calibri" w:eastAsia="Calibri" w:hAnsi="Calibri"/>
+                <w:b w:val="1"/>
+                <w:bCs w:val="1"/>
+                <w:sz w:val="18"/>
+                <w:szCs w:val="18"/>
+              </w:rPr>
+              <w:t xml:space="preserve">Rol / perfil</w:t>
+            </w:r>
+          </w:p>
+        </w:tc>
+        <w:tc>
+          <w:tcPr>
+            <w:tcW w:w="2025" w:type="dxa"/>
+            <w:shd w:val="clear" w:color="auto" w:fill="D9E2F3"/>
+          </w:tcPr>
+          <w:p>
+            <w:pPr>
+              <w:spacing w:after="40" w:lineRule="auto"/>
+            </w:pPr>
+            <w:r>
+              <w:rPr>
+                <w:rFonts w:ascii="Calibri" w:cs="Calibri" w:eastAsia="Calibri" w:hAnsi="Calibri"/>
+                <w:b w:val="1"/>
+                <w:bCs w:val="1"/>
+                <w:sz w:val="18"/>
+                <w:szCs w:val="18"/>
+              </w:rPr>
+              <w:t xml:space="preserve">Métrica principal</w:t>
+            </w:r>
+          </w:p>
+        </w:tc>
+      </w:tr>
+      <w:tr>
+        <w:trPr>
+          <w:cantSplit/>
+        </w:trPr>
+        <w:tc>
+          <w:tcPr>
+            <w:tcW w:w="700" w:type="dxa"/>
+          </w:tcPr>
+          <w:p>
+            <w:pPr>
+              <w:spacing w:after="40" w:lineRule="auto"/>
+            </w:pPr>
+            <w:r>
+              <w:rPr>
+                <w:rFonts w:ascii="Calibri" w:cs="Calibri" w:eastAsia="Calibri" w:hAnsi="Calibri"/>
+                <w:sz w:val="18"/>
+                <w:szCs w:val="18"/>
+              </w:rPr>
+              <w:t xml:space="preserve">T1</w:t>
+            </w:r>
+          </w:p>
+        </w:tc>
+        <w:tc>
+          <w:tcPr>
+            <w:tcW w:w="4300" w:type="dxa"/>
+          </w:tcPr>
+          <w:p>
+            <w:pPr>
+              <w:spacing w:after="40" w:lineRule="auto"/>
+            </w:pPr>
+            <w:r>
+              <w:rPr>
+                <w:rFonts w:ascii="Calibri" w:cs="Calibri" w:eastAsia="Calibri" w:hAnsi="Calibri"/>
+                <w:sz w:val="18"/>
+                <w:szCs w:val="18"/>
+              </w:rPr>
+              <w:t xml:space="preserve">Crear una cuenta e iniciar sesión.</w:t>
+            </w:r>
+          </w:p>
+        </w:tc>
+        <w:tc>
+          <w:tcPr>
+            <w:tcW w:w="2000" w:type="dxa"/>
+          </w:tcPr>
+          <w:p>
+            <w:pPr>
+              <w:spacing w:after="40" w:lineRule="auto"/>
+            </w:pPr>
+            <w:r>
+              <w:rPr>
+                <w:rFonts w:ascii="Calibri" w:cs="Calibri" w:eastAsia="Calibri" w:hAnsi="Calibri"/>
+                <w:sz w:val="18"/>
+                <w:szCs w:val="18"/>
+              </w:rPr>
+              <w:t xml:space="preserve">Paciente sin experiencia</w:t>
+            </w:r>
+          </w:p>
+        </w:tc>
+        <w:tc>
+          <w:tcPr>
+            <w:tcW w:w="2025" w:type="dxa"/>
+          </w:tcPr>
+          <w:p>
+            <w:pPr>
+              <w:spacing w:after="40" w:lineRule="auto"/>
+            </w:pPr>
+            <w:r>
+              <w:rPr>
+                <w:rFonts w:ascii="Calibri" w:cs="Calibri" w:eastAsia="Calibri" w:hAnsi="Calibri"/>
+                <w:sz w:val="18"/>
+                <w:szCs w:val="18"/>
+              </w:rPr>
+              <w:t xml:space="preserve">Éxito y tiempo</w:t>
+            </w:r>
+          </w:p>
+        </w:tc>
+      </w:tr>
+      <w:tr>
+        <w:trPr>
+          <w:cantSplit/>
+        </w:trPr>
+        <w:tc>
+          <w:tcPr>
+            <w:tcW w:w="700" w:type="dxa"/>
+          </w:tcPr>
+          <w:p>
+            <w:pPr>
+              <w:spacing w:after="40" w:lineRule="auto"/>
+            </w:pPr>
+            <w:r>
+              <w:rPr>
+                <w:rFonts w:ascii="Calibri" w:cs="Calibri" w:eastAsia="Calibri" w:hAnsi="Calibri"/>
+                <w:sz w:val="18"/>
+                <w:szCs w:val="18"/>
+              </w:rPr>
+              <w:t xml:space="preserve">T2</w:t>
+            </w:r>
+          </w:p>
+        </w:tc>
+        <w:tc>
+          <w:tcPr>
+            <w:tcW w:w="4300" w:type="dxa"/>
+          </w:tcPr>
+          <w:p>
+            <w:pPr>
+              <w:spacing w:after="40" w:lineRule="auto"/>
+            </w:pPr>
+            <w:r>
+              <w:rPr>
+                <w:rFonts w:ascii="Calibri" w:cs="Calibri" w:eastAsia="Calibri" w:hAnsi="Calibri"/>
+                <w:sz w:val="18"/>
+                <w:szCs w:val="18"/>
+              </w:rPr>
+              <w:t xml:space="preserve">Agendar una cita: elegir profesional, fecha y una franja libre.</w:t>
+            </w:r>
+          </w:p>
+        </w:tc>
+        <w:tc>
+          <w:tcPr>
+            <w:tcW w:w="2000" w:type="dxa"/>
+          </w:tcPr>
+          <w:p>
+            <w:pPr>
+              <w:spacing w:after="40" w:lineRule="auto"/>
+            </w:pPr>
+            <w:r>
+              <w:rPr>
+                <w:rFonts w:ascii="Calibri" w:cs="Calibri" w:eastAsia="Calibri" w:hAnsi="Calibri"/>
+                <w:sz w:val="18"/>
+                <w:szCs w:val="18"/>
+              </w:rPr>
+              <w:t xml:space="preserve">Paciente / agendador</w:t>
+            </w:r>
+          </w:p>
+        </w:tc>
+        <w:tc>
+          <w:tcPr>
+            <w:tcW w:w="2025" w:type="dxa"/>
+          </w:tcPr>
+          <w:p>
+            <w:pPr>
+              <w:spacing w:after="40" w:lineRule="auto"/>
+            </w:pPr>
+            <w:r>
+              <w:rPr>
+                <w:rFonts w:ascii="Calibri" w:cs="Calibri" w:eastAsia="Calibri" w:hAnsi="Calibri"/>
+                <w:sz w:val="18"/>
+                <w:szCs w:val="18"/>
+              </w:rPr>
+              <w:t xml:space="preserve">Éxito, tiempo y errores</w:t>
+            </w:r>
+          </w:p>
+        </w:tc>
+      </w:tr>
+      <w:tr>
+        <w:trPr>
+          <w:cantSplit/>
+        </w:trPr>
+        <w:tc>
+          <w:tcPr>
+            <w:tcW w:w="700" w:type="dxa"/>
+          </w:tcPr>
+          <w:p>
+            <w:pPr>
+              <w:spacing w:after="40" w:lineRule="auto"/>
+            </w:pPr>
+            <w:r>
+              <w:rPr>
+                <w:rFonts w:ascii="Calibri" w:cs="Calibri" w:eastAsia="Calibri" w:hAnsi="Calibri"/>
+                <w:sz w:val="18"/>
+                <w:szCs w:val="18"/>
+              </w:rPr>
+              <w:t xml:space="preserve">T3</w:t>
+            </w:r>
+          </w:p>
+        </w:tc>
+        <w:tc>
+          <w:tcPr>
+            <w:tcW w:w="4300" w:type="dxa"/>
+          </w:tcPr>
+          <w:p>
+            <w:pPr>
+              <w:spacing w:after="40" w:lineRule="auto"/>
+            </w:pPr>
+            <w:r>
+              <w:rPr>
+                <w:rFonts w:ascii="Calibri" w:cs="Calibri" w:eastAsia="Calibri" w:hAnsi="Calibri"/>
+                <w:sz w:val="18"/>
+                <w:szCs w:val="18"/>
+              </w:rPr>
+              <w:t xml:space="preserve">Consultar las franjas disponibles de un profesional en una fecha.</w:t>
+            </w:r>
+          </w:p>
+        </w:tc>
+        <w:tc>
+          <w:tcPr>
+            <w:tcW w:w="2000" w:type="dxa"/>
+          </w:tcPr>
+          <w:p>
+            <w:pPr>
+              <w:spacing w:after="40" w:lineRule="auto"/>
+            </w:pPr>
+            <w:r>
+              <w:rPr>
+                <w:rFonts w:ascii="Calibri" w:cs="Calibri" w:eastAsia="Calibri" w:hAnsi="Calibri"/>
+                <w:sz w:val="18"/>
+                <w:szCs w:val="18"/>
+              </w:rPr>
+              <w:t xml:space="preserve">Agendador</w:t>
+            </w:r>
+          </w:p>
+        </w:tc>
+        <w:tc>
+          <w:tcPr>
+            <w:tcW w:w="2025" w:type="dxa"/>
+          </w:tcPr>
+          <w:p>
+            <w:pPr>
+              <w:spacing w:after="40" w:lineRule="auto"/>
+            </w:pPr>
+            <w:r>
+              <w:rPr>
+                <w:rFonts w:ascii="Calibri" w:cs="Calibri" w:eastAsia="Calibri" w:hAnsi="Calibri"/>
+                <w:sz w:val="18"/>
+                <w:szCs w:val="18"/>
+              </w:rPr>
+              <w:t xml:space="preserve">Éxito y tiempo</w:t>
+            </w:r>
+          </w:p>
+        </w:tc>
+      </w:tr>
+      <w:tr>
+        <w:trPr>
+          <w:cantSplit/>
+        </w:trPr>
+        <w:tc>
+          <w:tcPr>
+            <w:tcW w:w="700" w:type="dxa"/>
+          </w:tcPr>
+          <w:p>
+            <w:pPr>
+              <w:spacing w:after="40" w:lineRule="auto"/>
+            </w:pPr>
+            <w:r>
+              <w:rPr>
+                <w:rFonts w:ascii="Calibri" w:cs="Calibri" w:eastAsia="Calibri" w:hAnsi="Calibri"/>
+                <w:sz w:val="18"/>
+                <w:szCs w:val="18"/>
+              </w:rPr>
+              <w:t xml:space="preserve">T4</w:t>
+            </w:r>
+          </w:p>
+        </w:tc>
+        <w:tc>
+          <w:tcPr>
+            <w:tcW w:w="4300" w:type="dxa"/>
+          </w:tcPr>
+          <w:p>
+            <w:pPr>
+              <w:spacing w:after="40" w:lineRule="auto"/>
+            </w:pPr>
+            <w:r>
+              <w:rPr>
+                <w:rFonts w:ascii="Calibri" w:cs="Calibri" w:eastAsia="Calibri" w:hAnsi="Calibri"/>
+                <w:sz w:val="18"/>
+                <w:szCs w:val="18"/>
+              </w:rPr>
+              <w:t xml:space="preserve">Listar las citas de un profesional en una fecha y filtrar.</w:t>
+            </w:r>
+          </w:p>
+        </w:tc>
+        <w:tc>
+          <w:tcPr>
+            <w:tcW w:w="2000" w:type="dxa"/>
+          </w:tcPr>
+          <w:p>
+            <w:pPr>
+              <w:spacing w:after="40" w:lineRule="auto"/>
+            </w:pPr>
+            <w:r>
+              <w:rPr>
+                <w:rFonts w:ascii="Calibri" w:cs="Calibri" w:eastAsia="Calibri" w:hAnsi="Calibri"/>
+                <w:sz w:val="18"/>
+                <w:szCs w:val="18"/>
+              </w:rPr>
+              <w:t xml:space="preserve">Profesional</w:t>
+            </w:r>
+          </w:p>
+        </w:tc>
+        <w:tc>
+          <w:tcPr>
+            <w:tcW w:w="2025" w:type="dxa"/>
+          </w:tcPr>
+          <w:p>
+            <w:pPr>
+              <w:spacing w:after="40" w:lineRule="auto"/>
+            </w:pPr>
+            <w:r>
+              <w:rPr>
+                <w:rFonts w:ascii="Calibri" w:cs="Calibri" w:eastAsia="Calibri" w:hAnsi="Calibri"/>
+                <w:sz w:val="18"/>
+                <w:szCs w:val="18"/>
+              </w:rPr>
+              <w:t xml:space="preserve">Éxito y tiempo</w:t>
+            </w:r>
+          </w:p>
+        </w:tc>
+      </w:tr>
+      <w:tr>
+        <w:trPr>
+          <w:cantSplit/>
+        </w:trPr>
+        <w:tc>
+          <w:tcPr>
+            <w:tcW w:w="700" w:type="dxa"/>
+          </w:tcPr>
+          <w:p>
+            <w:pPr>
+              <w:spacing w:after="40" w:lineRule="auto"/>
+            </w:pPr>
+            <w:r>
+              <w:rPr>
+                <w:rFonts w:ascii="Calibri" w:cs="Calibri" w:eastAsia="Calibri" w:hAnsi="Calibri"/>
+                <w:sz w:val="18"/>
+                <w:szCs w:val="18"/>
+              </w:rPr>
+              <w:t xml:space="preserve">T5</w:t>
+            </w:r>
+          </w:p>
+        </w:tc>
+        <w:tc>
+          <w:tcPr>
+            <w:tcW w:w="4300" w:type="dxa"/>
+          </w:tcPr>
+          <w:p>
+            <w:pPr>
+              <w:spacing w:after="40" w:lineRule="auto"/>
+            </w:pPr>
+            <w:r>
+              <w:rPr>
+                <w:rFonts w:ascii="Calibri" w:cs="Calibri" w:eastAsia="Calibri" w:hAnsi="Calibri"/>
+                <w:sz w:val="18"/>
+                <w:szCs w:val="18"/>
+              </w:rPr>
+              <w:t xml:space="preserve">Registrar el horario semanal y la duración de cita de un profesional.</w:t>
+            </w:r>
+          </w:p>
+        </w:tc>
+        <w:tc>
+          <w:tcPr>
+            <w:tcW w:w="2000" w:type="dxa"/>
+          </w:tcPr>
+          <w:p>
+            <w:pPr>
+              <w:spacing w:after="40" w:lineRule="auto"/>
+            </w:pPr>
+            <w:r>
+              <w:rPr>
+                <w:rFonts w:ascii="Calibri" w:cs="Calibri" w:eastAsia="Calibri" w:hAnsi="Calibri"/>
+                <w:sz w:val="18"/>
+                <w:szCs w:val="18"/>
+              </w:rPr>
+              <w:t xml:space="preserve">Administrador</w:t>
+            </w:r>
+          </w:p>
+        </w:tc>
+        <w:tc>
+          <w:tcPr>
+            <w:tcW w:w="2025" w:type="dxa"/>
+          </w:tcPr>
+          <w:p>
+            <w:pPr>
+              <w:spacing w:after="40" w:lineRule="auto"/>
+            </w:pPr>
+            <w:r>
+              <w:rPr>
+                <w:rFonts w:ascii="Calibri" w:cs="Calibri" w:eastAsia="Calibri" w:hAnsi="Calibri"/>
+                <w:sz w:val="18"/>
+                <w:szCs w:val="18"/>
+              </w:rPr>
+              <w:t xml:space="preserve">Éxito y errores</w:t>
+            </w:r>
+          </w:p>
+        </w:tc>
+      </w:tr>
+      <w:tr>
+        <w:trPr>
+          <w:cantSplit/>
+        </w:trPr>
+        <w:tc>
+          <w:tcPr>
+            <w:tcW w:w="700" w:type="dxa"/>
+          </w:tcPr>
+          <w:p>
+            <w:pPr>
+              <w:spacing w:after="40" w:lineRule="auto"/>
+            </w:pPr>
+            <w:r>
+              <w:rPr>
+                <w:rFonts w:ascii="Calibri" w:cs="Calibri" w:eastAsia="Calibri" w:hAnsi="Calibri"/>
+                <w:sz w:val="18"/>
+                <w:szCs w:val="18"/>
+              </w:rPr>
+              <w:t xml:space="preserve">T6</w:t>
+            </w:r>
+          </w:p>
+        </w:tc>
+        <w:tc>
+          <w:tcPr>
+            <w:tcW w:w="4300" w:type="dxa"/>
+          </w:tcPr>
+          <w:p>
+            <w:pPr>
+              <w:spacing w:after="40" w:lineRule="auto"/>
+            </w:pPr>
+            <w:r>
+              <w:rPr>
+                <w:rFonts w:ascii="Calibri" w:cs="Calibri" w:eastAsia="Calibri" w:hAnsi="Calibri"/>
+                <w:sz w:val="18"/>
+                <w:szCs w:val="18"/>
+              </w:rPr>
+              <w:t xml:space="preserve">Aumentar y disminuir el tamaño del texto con el panel de accesibilidad.</w:t>
+            </w:r>
+          </w:p>
+        </w:tc>
+        <w:tc>
+          <w:tcPr>
+            <w:tcW w:w="2000" w:type="dxa"/>
+          </w:tcPr>
+          <w:p>
+            <w:pPr>
+              <w:spacing w:after="40" w:lineRule="auto"/>
+            </w:pPr>
+            <w:r>
+              <w:rPr>
+                <w:rFonts w:ascii="Calibri" w:cs="Calibri" w:eastAsia="Calibri" w:hAnsi="Calibri"/>
+                <w:sz w:val="18"/>
+                <w:szCs w:val="18"/>
+              </w:rPr>
+              <w:t xml:space="preserve">Usuario con limitación visual</w:t>
+            </w:r>
+          </w:p>
+        </w:tc>
+        <w:tc>
+          <w:tcPr>
+            <w:tcW w:w="2025" w:type="dxa"/>
+          </w:tcPr>
+          <w:p>
+            <w:pPr>
+              <w:spacing w:after="40" w:lineRule="auto"/>
+            </w:pPr>
+            <w:r>
+              <w:rPr>
+                <w:rFonts w:ascii="Calibri" w:cs="Calibri" w:eastAsia="Calibri" w:hAnsi="Calibri"/>
+                <w:sz w:val="18"/>
+                <w:szCs w:val="18"/>
+              </w:rPr>
+              <w:t xml:space="preserve">Éxito y respuesta visual &lt; 200 ms</w:t>
+            </w:r>
+          </w:p>
+        </w:tc>
+      </w:tr>
+      <w:tr>
+        <w:trPr>
+          <w:cantSplit/>
+        </w:trPr>
+        <w:tc>
+          <w:tcPr>
+            <w:tcW w:w="700" w:type="dxa"/>
+          </w:tcPr>
+          <w:p>
+            <w:pPr>
+              <w:spacing w:after="40" w:lineRule="auto"/>
+            </w:pPr>
+            <w:r>
+              <w:rPr>
+                <w:rFonts w:ascii="Calibri" w:cs="Calibri" w:eastAsia="Calibri" w:hAnsi="Calibri"/>
+                <w:sz w:val="18"/>
+                <w:szCs w:val="18"/>
+              </w:rPr>
+              <w:t xml:space="preserve">T7</w:t>
+            </w:r>
+          </w:p>
+        </w:tc>
+        <w:tc>
+          <w:tcPr>
+            <w:tcW w:w="4300" w:type="dxa"/>
+          </w:tcPr>
+          <w:p>
+            <w:pPr>
+              <w:spacing w:after="40" w:lineRule="auto"/>
+            </w:pPr>
+            <w:r>
+              <w:rPr>
+                <w:rFonts w:ascii="Calibri" w:cs="Calibri" w:eastAsia="Calibri" w:hAnsi="Calibri"/>
+                <w:sz w:val="18"/>
+                <w:szCs w:val="18"/>
+              </w:rPr>
+              <w:t xml:space="preserve">Enviar un formulario incompleto e interpretar y corregir el mensaje de error.</w:t>
+            </w:r>
+          </w:p>
+        </w:tc>
+        <w:tc>
+          <w:tcPr>
+            <w:tcW w:w="2000" w:type="dxa"/>
+          </w:tcPr>
+          <w:p>
+            <w:pPr>
+              <w:spacing w:after="40" w:lineRule="auto"/>
+            </w:pPr>
+            <w:r>
+              <w:rPr>
+                <w:rFonts w:ascii="Calibri" w:cs="Calibri" w:eastAsia="Calibri" w:hAnsi="Calibri"/>
+                <w:sz w:val="18"/>
+                <w:szCs w:val="18"/>
+              </w:rPr>
+              <w:t xml:space="preserve">Usuario con poca experiencia</w:t>
+            </w:r>
+          </w:p>
+        </w:tc>
+        <w:tc>
+          <w:tcPr>
+            <w:tcW w:w="2025" w:type="dxa"/>
+          </w:tcPr>
+          <w:p>
+            <w:pPr>
+              <w:spacing w:after="40" w:lineRule="auto"/>
+            </w:pPr>
+            <w:r>
+              <w:rPr>
+                <w:rFonts w:ascii="Calibri" w:cs="Calibri" w:eastAsia="Calibri" w:hAnsi="Calibri"/>
+                <w:sz w:val="18"/>
+                <w:szCs w:val="18"/>
+              </w:rPr>
+              <w:t xml:space="preserve">Corrección tras el primer aviso (meta ≥ 85 %)</w:t>
+            </w:r>
+          </w:p>
+        </w:tc>
+      </w:tr>
+    </w:tbl>
+    <w:p>
+      <w:pPr>
+        <w:spacing w:after="120" w:lineRule="auto"/>
+      </w:pPr>
+      <w:r>
+        <w:rPr>
+          <w:rFonts w:ascii="Calibri" w:cs="Calibri" w:eastAsia="Calibri" w:hAnsi="Calibri"/>
+        </w:rPr>
+        <w:t xml:space="preserve"/>
+      </w:r>
+    </w:p>
+    <w:p>
+      <w:pPr>
+        <w:spacing w:after="60" w:lineRule="auto"/>
+      </w:pPr>
+      <w:r>
+        <w:rPr>
+          <w:rFonts w:ascii="Calibri" w:cs="Calibri" w:eastAsia="Calibri" w:hAnsi="Calibri"/>
+          <w:b w:val="1"/>
+          <w:bCs w:val="1"/>
+        </w:rPr>
+        <w:t xml:space="preserve">Métricas y criterios de éxito</w:t>
+      </w:r>
+    </w:p>
+    <w:p>
+      <w:pPr>
+        <w:spacing w:after="60" w:lineRule="auto"/>
+        <w:ind w:left="500" w:hanging="250"/>
+      </w:pPr>
+      <w:r>
+        <w:rPr>
+          <w:rFonts w:ascii="Calibri" w:cs="Calibri" w:eastAsia="Calibri" w:hAnsi="Calibri"/>
+        </w:rPr>
+        <w:t xml:space="preserve">•  Tasa de éxito por tarea: porcentaje de participantes que la completan sin ayuda.</w:t>
+      </w:r>
+    </w:p>
+    <w:p>
+      <w:pPr>
+        <w:spacing w:after="60" w:lineRule="auto"/>
+        <w:ind w:left="500" w:hanging="250"/>
+      </w:pPr>
+      <w:r>
+        <w:rPr>
+          <w:rFonts w:ascii="Calibri" w:cs="Calibri" w:eastAsia="Calibri" w:hAnsi="Calibri"/>
+        </w:rPr>
+        <w:t xml:space="preserve">•  Tiempo por tarea y número de errores cometidos.</w:t>
+      </w:r>
+    </w:p>
+    <w:p>
+      <w:pPr>
+        <w:spacing w:after="60" w:lineRule="auto"/>
+        <w:ind w:left="500" w:hanging="250"/>
+      </w:pPr>
+      <w:r>
+        <w:rPr>
+          <w:rFonts w:ascii="Calibri" w:cs="Calibri" w:eastAsia="Calibri" w:hAnsi="Calibri"/>
+        </w:rPr>
+        <w:t xml:space="preserve">•  Corrección de errores de formulario tras el primer aviso: 85 % o más (escenario de calidad de usabilidad).</w:t>
+      </w:r>
+    </w:p>
+    <w:p>
+      <w:pPr>
+        <w:spacing w:after="60" w:lineRule="auto"/>
+        <w:ind w:left="500" w:hanging="250"/>
+      </w:pPr>
+      <w:r>
+        <w:rPr>
+          <w:rFonts w:ascii="Calibri" w:cs="Calibri" w:eastAsia="Calibri" w:hAnsi="Calibri"/>
+        </w:rPr>
+        <w:t xml:space="preserve">•  Respuesta visual del cambio de tamaño de texto y de las alertas: menos de 200 ms.</w:t>
+      </w:r>
+    </w:p>
+    <w:p>
+      <w:pPr>
+        <w:spacing w:after="60" w:lineRule="auto"/>
+        <w:ind w:left="500" w:hanging="250"/>
+      </w:pPr>
+      <w:r>
+        <w:rPr>
+          <w:rFonts w:ascii="Calibri" w:cs="Calibri" w:eastAsia="Calibri" w:hAnsi="Calibri"/>
+        </w:rPr>
+        <w:t xml:space="preserve">•  Satisfacción: promedio de la calificación de 1 a 5 por tarea.</w:t>
+      </w:r>
+    </w:p>
+    <w:p>
+      <w:pPr>
+        <w:spacing w:after="60" w:lineRule="auto"/>
+      </w:pPr>
+      <w:r>
+        <w:rPr>
+          <w:rFonts w:ascii="Calibri" w:cs="Calibri" w:eastAsia="Calibri" w:hAnsi="Calibri"/>
+        </w:rPr>
+        <w:t xml:space="preserve"/>
+      </w:r>
+    </w:p>
+    <w:p>
+      <w:pPr>
+        <w:spacing w:after="60" w:lineRule="auto"/>
+      </w:pPr>
+      <w:r>
+        <w:rPr>
+          <w:rFonts w:ascii="Calibri" w:cs="Calibri" w:eastAsia="Calibri" w:hAnsi="Calibri"/>
+          <w:b w:val="1"/>
+          <w:bCs w:val="1"/>
+        </w:rPr>
+        <w:t xml:space="preserve">Registro de resultados</w:t>
+      </w:r>
+    </w:p>
+    <w:tbl>
+      <w:tblPr>
+        <w:tblW w:w="9025" w:type="dxa"/>
+        <w:tblBorders>
+          <w:top w:val="single" w:sz="4" w:space="0" w:color="000000"/>
+          <w:left w:val="single" w:sz="4" w:space="0" w:color="000000"/>
+          <w:bottom w:val="single" w:sz="4" w:space="0" w:color="000000"/>
+          <w:right w:val="single" w:sz="4" w:space="0" w:color="000000"/>
+          <w:insideH w:val="single" w:sz="4" w:space="0" w:color="000000"/>
+          <w:insideV w:val="single" w:sz="4" w:space="0" w:color="000000"/>
+        </w:tblBorders>
+        <w:tblLayout w:type="fixed"/>
+        <w:tblCellMar>
+          <w:left w:w="80" w:type="dxa"/>
+          <w:right w:w="80" w:type="dxa"/>
+        </w:tblCellMar>
+      </w:tblPr>
+      <w:tblGrid>
+        <w:gridCol w:w="800"/>
+        <w:gridCol w:w="1800"/>
+        <w:gridCol w:w="1300"/>
+        <w:gridCol w:w="1300"/>
+        <w:gridCol w:w="1100"/>
+        <w:gridCol w:w="2725"/>
+      </w:tblGrid>
+      <w:tr>
+        <w:trPr>
+          <w:tblHeader/>
+        </w:trPr>
+        <w:tc>
+          <w:tcPr>
+            <w:tcW w:w="800" w:type="dxa"/>
+            <w:shd w:val="clear" w:color="auto" w:fill="D9E2F3"/>
+          </w:tcPr>
+          <w:p>
+            <w:pPr>
+              <w:spacing w:after="40" w:lineRule="auto"/>
+            </w:pPr>
+            <w:r>
+              <w:rPr>
+                <w:rFonts w:ascii="Calibri" w:cs="Calibri" w:eastAsia="Calibri" w:hAnsi="Calibri"/>
+                <w:b w:val="1"/>
+                <w:bCs w:val="1"/>
+                <w:sz w:val="18"/>
+                <w:szCs w:val="18"/>
+              </w:rPr>
+              <w:t xml:space="preserve">Tarea</w:t>
+            </w:r>
+          </w:p>
+        </w:tc>
+        <w:tc>
+          <w:tcPr>
+            <w:tcW w:w="1800" w:type="dxa"/>
+            <w:shd w:val="clear" w:color="auto" w:fill="D9E2F3"/>
+          </w:tcPr>
+          <w:p>
+            <w:pPr>
+              <w:spacing w:after="40" w:lineRule="auto"/>
+            </w:pPr>
+            <w:r>
+              <w:rPr>
+                <w:rFonts w:ascii="Calibri" w:cs="Calibri" w:eastAsia="Calibri" w:hAnsi="Calibri"/>
+                <w:b w:val="1"/>
+                <w:bCs w:val="1"/>
+                <w:sz w:val="18"/>
+                <w:szCs w:val="18"/>
+              </w:rPr>
+              <w:t xml:space="preserve">Participante</w:t>
+            </w:r>
+          </w:p>
+        </w:tc>
+        <w:tc>
+          <w:tcPr>
+            <w:tcW w:w="1300" w:type="dxa"/>
+            <w:shd w:val="clear" w:color="auto" w:fill="D9E2F3"/>
+          </w:tcPr>
+          <w:p>
+            <w:pPr>
+              <w:spacing w:after="40" w:lineRule="auto"/>
+            </w:pPr>
+            <w:r>
+              <w:rPr>
+                <w:rFonts w:ascii="Calibri" w:cs="Calibri" w:eastAsia="Calibri" w:hAnsi="Calibri"/>
+                <w:b w:val="1"/>
+                <w:bCs w:val="1"/>
+                <w:sz w:val="18"/>
+                <w:szCs w:val="18"/>
+              </w:rPr>
+              <w:t xml:space="preserve">¿Completó?</w:t>
+            </w:r>
+          </w:p>
+        </w:tc>
+        <w:tc>
+          <w:tcPr>
+            <w:tcW w:w="1300" w:type="dxa"/>
+            <w:shd w:val="clear" w:color="auto" w:fill="D9E2F3"/>
+          </w:tcPr>
+          <w:p>
+            <w:pPr>
+              <w:spacing w:after="40" w:lineRule="auto"/>
+            </w:pPr>
+            <w:r>
+              <w:rPr>
+                <w:rFonts w:ascii="Calibri" w:cs="Calibri" w:eastAsia="Calibri" w:hAnsi="Calibri"/>
+                <w:b w:val="1"/>
+                <w:bCs w:val="1"/>
+                <w:sz w:val="18"/>
+                <w:szCs w:val="18"/>
+              </w:rPr>
+              <w:t xml:space="preserve">Tiempo (s)</w:t>
+            </w:r>
+          </w:p>
+        </w:tc>
+        <w:tc>
+          <w:tcPr>
+            <w:tcW w:w="1100" w:type="dxa"/>
+            <w:shd w:val="clear" w:color="auto" w:fill="D9E2F3"/>
+          </w:tcPr>
+          <w:p>
+            <w:pPr>
+              <w:spacing w:after="40" w:lineRule="auto"/>
+            </w:pPr>
+            <w:r>
+              <w:rPr>
+                <w:rFonts w:ascii="Calibri" w:cs="Calibri" w:eastAsia="Calibri" w:hAnsi="Calibri"/>
+                <w:b w:val="1"/>
+                <w:bCs w:val="1"/>
+                <w:sz w:val="18"/>
+                <w:szCs w:val="18"/>
+              </w:rPr>
+              <w:t xml:space="preserve">Errores</w:t>
+            </w:r>
+          </w:p>
+        </w:tc>
+        <w:tc>
+          <w:tcPr>
+            <w:tcW w:w="2725" w:type="dxa"/>
+            <w:shd w:val="clear" w:color="auto" w:fill="D9E2F3"/>
+          </w:tcPr>
+          <w:p>
+            <w:pPr>
+              <w:spacing w:after="40" w:lineRule="auto"/>
+            </w:pPr>
+            <w:r>
+              <w:rPr>
+                <w:rFonts w:ascii="Calibri" w:cs="Calibri" w:eastAsia="Calibri" w:hAnsi="Calibri"/>
+                <w:b w:val="1"/>
+                <w:bCs w:val="1"/>
+                <w:sz w:val="18"/>
+                <w:szCs w:val="18"/>
+              </w:rPr>
+              <w:t xml:space="preserve">Observaciones</w:t>
+            </w:r>
+          </w:p>
+        </w:tc>
+      </w:tr>
+      <w:tr>
+        <w:trPr>
+          <w:cantSplit/>
+        </w:trPr>
+        <w:tc>
+          <w:tcPr>
+            <w:tcW w:w="800" w:type="dxa"/>
+          </w:tcPr>
+          <w:p>
+            <w:pPr>
+              <w:spacing w:after="40" w:lineRule="auto"/>
+            </w:pPr>
+            <w:r>
+              <w:rPr>
+                <w:rFonts w:ascii="Calibri" w:cs="Calibri" w:eastAsia="Calibri" w:hAnsi="Calibri"/>
+                <w:sz w:val="18"/>
+                <w:szCs w:val="18"/>
+              </w:rPr>
+              <w:t xml:space="preserve">T1</w:t>
+            </w:r>
+          </w:p>
+        </w:tc>
+        <w:tc>
+          <w:tcPr>
+            <w:tcW w:w="1800" w:type="dxa"/>
+          </w:tcPr>
+          <w:p>
+            <w:pPr>
+              <w:spacing w:after="40" w:lineRule="auto"/>
+            </w:pPr>
+            <w:r>
+              <w:rPr>
+                <w:rFonts w:ascii="Calibri" w:cs="Calibri" w:eastAsia="Calibri" w:hAnsi="Calibri"/>
+                <w:sz w:val="18"/>
+                <w:szCs w:val="18"/>
+              </w:rPr>
+              <w:t xml:space="preserve"/>
+            </w:r>
+          </w:p>
+        </w:tc>
+        <w:tc>
+          <w:tcPr>
+            <w:tcW w:w="1300" w:type="dxa"/>
+          </w:tcPr>
+          <w:p>
+            <w:pPr>
+              <w:spacing w:after="40" w:lineRule="auto"/>
+            </w:pPr>
+            <w:r>
+              <w:rPr>
+                <w:rFonts w:ascii="Calibri" w:cs="Calibri" w:eastAsia="Calibri" w:hAnsi="Calibri"/>
+                <w:sz w:val="18"/>
+                <w:szCs w:val="18"/>
+              </w:rPr>
+              <w:t xml:space="preserve"/>
+            </w:r>
+          </w:p>
+        </w:tc>
+        <w:tc>
+          <w:tcPr>
+            <w:tcW w:w="1300" w:type="dxa"/>
+          </w:tcPr>
+          <w:p>
+            <w:pPr>
+              <w:spacing w:after="40" w:lineRule="auto"/>
+            </w:pPr>
+            <w:r>
+              <w:rPr>
+                <w:rFonts w:ascii="Calibri" w:cs="Calibri" w:eastAsia="Calibri" w:hAnsi="Calibri"/>
+                <w:sz w:val="18"/>
+                <w:szCs w:val="18"/>
+              </w:rPr>
+              <w:t xml:space="preserve"/>
+            </w:r>
+          </w:p>
+        </w:tc>
+        <w:tc>
+          <w:tcPr>
+            <w:tcW w:w="1100" w:type="dxa"/>
+          </w:tcPr>
+          <w:p>
+            <w:pPr>
+              <w:spacing w:after="40" w:lineRule="auto"/>
+            </w:pPr>
+            <w:r>
+              <w:rPr>
+                <w:rFonts w:ascii="Calibri" w:cs="Calibri" w:eastAsia="Calibri" w:hAnsi="Calibri"/>
+                <w:sz w:val="18"/>
+                <w:szCs w:val="18"/>
+              </w:rPr>
+              <w:t xml:space="preserve"/>
+            </w:r>
+          </w:p>
+        </w:tc>
+        <w:tc>
+          <w:tcPr>
+            <w:tcW w:w="2725" w:type="dxa"/>
+          </w:tcPr>
+          <w:p>
+            <w:pPr>
+              <w:spacing w:after="40" w:lineRule="auto"/>
+            </w:pPr>
+            <w:r>
+              <w:rPr>
+                <w:rFonts w:ascii="Calibri" w:cs="Calibri" w:eastAsia="Calibri" w:hAnsi="Calibri"/>
+                <w:sz w:val="18"/>
+                <w:szCs w:val="18"/>
+              </w:rPr>
+              <w:t xml:space="preserve"/>
+            </w:r>
+          </w:p>
+        </w:tc>
+      </w:tr>
+      <w:tr>
+        <w:trPr>
+          <w:cantSplit/>
+        </w:trPr>
+        <w:tc>
+          <w:tcPr>
+            <w:tcW w:w="800" w:type="dxa"/>
+          </w:tcPr>
+          <w:p>
+            <w:pPr>
+              <w:spacing w:after="40" w:lineRule="auto"/>
+            </w:pPr>
+            <w:r>
+              <w:rPr>
+                <w:rFonts w:ascii="Calibri" w:cs="Calibri" w:eastAsia="Calibri" w:hAnsi="Calibri"/>
+                <w:sz w:val="18"/>
+                <w:szCs w:val="18"/>
+              </w:rPr>
+              <w:t xml:space="preserve">T2</w:t>
+            </w:r>
+          </w:p>
+        </w:tc>
+        <w:tc>
+          <w:tcPr>
+            <w:tcW w:w="1800" w:type="dxa"/>
+          </w:tcPr>
+          <w:p>
+            <w:pPr>
+              <w:spacing w:after="40" w:lineRule="auto"/>
+            </w:pPr>
+            <w:r>
+              <w:rPr>
+                <w:rFonts w:ascii="Calibri" w:cs="Calibri" w:eastAsia="Calibri" w:hAnsi="Calibri"/>
+                <w:sz w:val="18"/>
+                <w:szCs w:val="18"/>
+              </w:rPr>
+              <w:t xml:space="preserve"/>
+            </w:r>
+          </w:p>
+        </w:tc>
+        <w:tc>
+          <w:tcPr>
+            <w:tcW w:w="1300" w:type="dxa"/>
+          </w:tcPr>
+          <w:p>
+            <w:pPr>
+              <w:spacing w:after="40" w:lineRule="auto"/>
+            </w:pPr>
+            <w:r>
+              <w:rPr>
+                <w:rFonts w:ascii="Calibri" w:cs="Calibri" w:eastAsia="Calibri" w:hAnsi="Calibri"/>
+                <w:sz w:val="18"/>
+                <w:szCs w:val="18"/>
+              </w:rPr>
+              <w:t xml:space="preserve"/>
+            </w:r>
+          </w:p>
+        </w:tc>
+        <w:tc>
+          <w:tcPr>
+            <w:tcW w:w="1300" w:type="dxa"/>
+          </w:tcPr>
+          <w:p>
+            <w:pPr>
+              <w:spacing w:after="40" w:lineRule="auto"/>
+            </w:pPr>
+            <w:r>
+              <w:rPr>
+                <w:rFonts w:ascii="Calibri" w:cs="Calibri" w:eastAsia="Calibri" w:hAnsi="Calibri"/>
+                <w:sz w:val="18"/>
+                <w:szCs w:val="18"/>
+              </w:rPr>
+              <w:t xml:space="preserve"/>
+            </w:r>
+          </w:p>
+        </w:tc>
+        <w:tc>
+          <w:tcPr>
+            <w:tcW w:w="1100" w:type="dxa"/>
+          </w:tcPr>
+          <w:p>
+            <w:pPr>
+              <w:spacing w:after="40" w:lineRule="auto"/>
+            </w:pPr>
+            <w:r>
+              <w:rPr>
+                <w:rFonts w:ascii="Calibri" w:cs="Calibri" w:eastAsia="Calibri" w:hAnsi="Calibri"/>
+                <w:sz w:val="18"/>
+                <w:szCs w:val="18"/>
+              </w:rPr>
+              <w:t xml:space="preserve"/>
+            </w:r>
+          </w:p>
+        </w:tc>
+        <w:tc>
+          <w:tcPr>
+            <w:tcW w:w="2725" w:type="dxa"/>
+          </w:tcPr>
+          <w:p>
+            <w:pPr>
+              <w:spacing w:after="40" w:lineRule="auto"/>
+            </w:pPr>
+            <w:r>
+              <w:rPr>
+                <w:rFonts w:ascii="Calibri" w:cs="Calibri" w:eastAsia="Calibri" w:hAnsi="Calibri"/>
+                <w:sz w:val="18"/>
+                <w:szCs w:val="18"/>
+              </w:rPr>
+              <w:t xml:space="preserve"/>
+            </w:r>
+          </w:p>
+        </w:tc>
+      </w:tr>
+      <w:tr>
+        <w:trPr>
+          <w:cantSplit/>
+        </w:trPr>
+        <w:tc>
+          <w:tcPr>
+            <w:tcW w:w="800" w:type="dxa"/>
+          </w:tcPr>
+          <w:p>
+            <w:pPr>
+              <w:spacing w:after="40" w:lineRule="auto"/>
+            </w:pPr>
+            <w:r>
+              <w:rPr>
+                <w:rFonts w:ascii="Calibri" w:cs="Calibri" w:eastAsia="Calibri" w:hAnsi="Calibri"/>
+                <w:sz w:val="18"/>
+                <w:szCs w:val="18"/>
+              </w:rPr>
+              <w:t xml:space="preserve">T3</w:t>
+            </w:r>
+          </w:p>
+        </w:tc>
+        <w:tc>
+          <w:tcPr>
+            <w:tcW w:w="1800" w:type="dxa"/>
+          </w:tcPr>
+          <w:p>
+            <w:pPr>
+              <w:spacing w:after="40" w:lineRule="auto"/>
+            </w:pPr>
+            <w:r>
+              <w:rPr>
+                <w:rFonts w:ascii="Calibri" w:cs="Calibri" w:eastAsia="Calibri" w:hAnsi="Calibri"/>
+                <w:sz w:val="18"/>
+                <w:szCs w:val="18"/>
+              </w:rPr>
+              <w:t xml:space="preserve"/>
+            </w:r>
+          </w:p>
+        </w:tc>
+        <w:tc>
+          <w:tcPr>
+            <w:tcW w:w="1300" w:type="dxa"/>
+          </w:tcPr>
+          <w:p>
+            <w:pPr>
+              <w:spacing w:after="40" w:lineRule="auto"/>
+            </w:pPr>
+            <w:r>
+              <w:rPr>
+                <w:rFonts w:ascii="Calibri" w:cs="Calibri" w:eastAsia="Calibri" w:hAnsi="Calibri"/>
+                <w:sz w:val="18"/>
+                <w:szCs w:val="18"/>
+              </w:rPr>
+              <w:t xml:space="preserve"/>
+            </w:r>
+          </w:p>
+        </w:tc>
+        <w:tc>
+          <w:tcPr>
+            <w:tcW w:w="1300" w:type="dxa"/>
+          </w:tcPr>
+          <w:p>
+            <w:pPr>
+              <w:spacing w:after="40" w:lineRule="auto"/>
+            </w:pPr>
+            <w:r>
+              <w:rPr>
+                <w:rFonts w:ascii="Calibri" w:cs="Calibri" w:eastAsia="Calibri" w:hAnsi="Calibri"/>
+                <w:sz w:val="18"/>
+                <w:szCs w:val="18"/>
+              </w:rPr>
+              <w:t xml:space="preserve"/>
+            </w:r>
+          </w:p>
+        </w:tc>
+        <w:tc>
+          <w:tcPr>
+            <w:tcW w:w="1100" w:type="dxa"/>
+          </w:tcPr>
+          <w:p>
+            <w:pPr>
+              <w:spacing w:after="40" w:lineRule="auto"/>
+            </w:pPr>
+            <w:r>
+              <w:rPr>
+                <w:rFonts w:ascii="Calibri" w:cs="Calibri" w:eastAsia="Calibri" w:hAnsi="Calibri"/>
+                <w:sz w:val="18"/>
+                <w:szCs w:val="18"/>
+              </w:rPr>
+              <w:t xml:space="preserve"/>
+            </w:r>
+          </w:p>
+        </w:tc>
+        <w:tc>
+          <w:tcPr>
+            <w:tcW w:w="2725" w:type="dxa"/>
+          </w:tcPr>
+          <w:p>
+            <w:pPr>
+              <w:spacing w:after="40" w:lineRule="auto"/>
+            </w:pPr>
+            <w:r>
+              <w:rPr>
+                <w:rFonts w:ascii="Calibri" w:cs="Calibri" w:eastAsia="Calibri" w:hAnsi="Calibri"/>
+                <w:sz w:val="18"/>
+                <w:szCs w:val="18"/>
+              </w:rPr>
+              <w:t xml:space="preserve"/>
+            </w:r>
+          </w:p>
+        </w:tc>
+      </w:tr>
+      <w:tr>
+        <w:trPr>
+          <w:cantSplit/>
+        </w:trPr>
+        <w:tc>
+          <w:tcPr>
+            <w:tcW w:w="800" w:type="dxa"/>
+          </w:tcPr>
+          <w:p>
+            <w:pPr>
+              <w:spacing w:after="40" w:lineRule="auto"/>
+            </w:pPr>
+            <w:r>
+              <w:rPr>
+                <w:rFonts w:ascii="Calibri" w:cs="Calibri" w:eastAsia="Calibri" w:hAnsi="Calibri"/>
+                <w:sz w:val="18"/>
+                <w:szCs w:val="18"/>
+              </w:rPr>
+              <w:t xml:space="preserve">T4</w:t>
+            </w:r>
+          </w:p>
+        </w:tc>
+        <w:tc>
+          <w:tcPr>
+            <w:tcW w:w="1800" w:type="dxa"/>
+          </w:tcPr>
+          <w:p>
+            <w:pPr>
+              <w:spacing w:after="40" w:lineRule="auto"/>
+            </w:pPr>
+            <w:r>
+              <w:rPr>
+                <w:rFonts w:ascii="Calibri" w:cs="Calibri" w:eastAsia="Calibri" w:hAnsi="Calibri"/>
+                <w:sz w:val="18"/>
+                <w:szCs w:val="18"/>
+              </w:rPr>
+              <w:t xml:space="preserve"/>
+            </w:r>
+          </w:p>
+        </w:tc>
+        <w:tc>
+          <w:tcPr>
+            <w:tcW w:w="1300" w:type="dxa"/>
+          </w:tcPr>
+          <w:p>
+            <w:pPr>
+              <w:spacing w:after="40" w:lineRule="auto"/>
+            </w:pPr>
+            <w:r>
+              <w:rPr>
+                <w:rFonts w:ascii="Calibri" w:cs="Calibri" w:eastAsia="Calibri" w:hAnsi="Calibri"/>
+                <w:sz w:val="18"/>
+                <w:szCs w:val="18"/>
+              </w:rPr>
+              <w:t xml:space="preserve"/>
+            </w:r>
+          </w:p>
+        </w:tc>
+        <w:tc>
+          <w:tcPr>
+            <w:tcW w:w="1300" w:type="dxa"/>
+          </w:tcPr>
+          <w:p>
+            <w:pPr>
+              <w:spacing w:after="40" w:lineRule="auto"/>
+            </w:pPr>
+            <w:r>
+              <w:rPr>
+                <w:rFonts w:ascii="Calibri" w:cs="Calibri" w:eastAsia="Calibri" w:hAnsi="Calibri"/>
+                <w:sz w:val="18"/>
+                <w:szCs w:val="18"/>
+              </w:rPr>
+              <w:t xml:space="preserve"/>
+            </w:r>
+          </w:p>
+        </w:tc>
+        <w:tc>
+          <w:tcPr>
+            <w:tcW w:w="1100" w:type="dxa"/>
+          </w:tcPr>
+          <w:p>
+            <w:pPr>
+              <w:spacing w:after="40" w:lineRule="auto"/>
+            </w:pPr>
+            <w:r>
+              <w:rPr>
+                <w:rFonts w:ascii="Calibri" w:cs="Calibri" w:eastAsia="Calibri" w:hAnsi="Calibri"/>
+                <w:sz w:val="18"/>
+                <w:szCs w:val="18"/>
+              </w:rPr>
+              <w:t xml:space="preserve"/>
+            </w:r>
+          </w:p>
+        </w:tc>
+        <w:tc>
+          <w:tcPr>
+            <w:tcW w:w="2725" w:type="dxa"/>
+          </w:tcPr>
+          <w:p>
+            <w:pPr>
+              <w:spacing w:after="40" w:lineRule="auto"/>
+            </w:pPr>
+            <w:r>
+              <w:rPr>
+                <w:rFonts w:ascii="Calibri" w:cs="Calibri" w:eastAsia="Calibri" w:hAnsi="Calibri"/>
+                <w:sz w:val="18"/>
+                <w:szCs w:val="18"/>
+              </w:rPr>
+              <w:t xml:space="preserve"/>
+            </w:r>
+          </w:p>
+        </w:tc>
+      </w:tr>
+      <w:tr>
+        <w:trPr>
+          <w:cantSplit/>
+        </w:trPr>
+        <w:tc>
+          <w:tcPr>
+            <w:tcW w:w="800" w:type="dxa"/>
+          </w:tcPr>
+          <w:p>
+            <w:pPr>
+              <w:spacing w:after="40" w:lineRule="auto"/>
+            </w:pPr>
+            <w:r>
+              <w:rPr>
+                <w:rFonts w:ascii="Calibri" w:cs="Calibri" w:eastAsia="Calibri" w:hAnsi="Calibri"/>
+                <w:sz w:val="18"/>
+                <w:szCs w:val="18"/>
+              </w:rPr>
+              <w:t xml:space="preserve">T5</w:t>
+            </w:r>
+          </w:p>
+        </w:tc>
+        <w:tc>
+          <w:tcPr>
+            <w:tcW w:w="1800" w:type="dxa"/>
+          </w:tcPr>
+          <w:p>
+            <w:pPr>
+              <w:spacing w:after="40" w:lineRule="auto"/>
+            </w:pPr>
+            <w:r>
+              <w:rPr>
+                <w:rFonts w:ascii="Calibri" w:cs="Calibri" w:eastAsia="Calibri" w:hAnsi="Calibri"/>
+                <w:sz w:val="18"/>
+                <w:szCs w:val="18"/>
+              </w:rPr>
+              <w:t xml:space="preserve"/>
+            </w:r>
+          </w:p>
+        </w:tc>
+        <w:tc>
+          <w:tcPr>
+            <w:tcW w:w="1300" w:type="dxa"/>
+          </w:tcPr>
+          <w:p>
+            <w:pPr>
+              <w:spacing w:after="40" w:lineRule="auto"/>
+            </w:pPr>
+            <w:r>
+              <w:rPr>
+                <w:rFonts w:ascii="Calibri" w:cs="Calibri" w:eastAsia="Calibri" w:hAnsi="Calibri"/>
+                <w:sz w:val="18"/>
+                <w:szCs w:val="18"/>
+              </w:rPr>
+              <w:t xml:space="preserve"/>
+            </w:r>
+          </w:p>
+        </w:tc>
+        <w:tc>
+          <w:tcPr>
+            <w:tcW w:w="1300" w:type="dxa"/>
+          </w:tcPr>
+          <w:p>
+            <w:pPr>
+              <w:spacing w:after="40" w:lineRule="auto"/>
+            </w:pPr>
+            <w:r>
+              <w:rPr>
+                <w:rFonts w:ascii="Calibri" w:cs="Calibri" w:eastAsia="Calibri" w:hAnsi="Calibri"/>
+                <w:sz w:val="18"/>
+                <w:szCs w:val="18"/>
+              </w:rPr>
+              <w:t xml:space="preserve"/>
+            </w:r>
+          </w:p>
+        </w:tc>
+        <w:tc>
+          <w:tcPr>
+            <w:tcW w:w="1100" w:type="dxa"/>
+          </w:tcPr>
+          <w:p>
+            <w:pPr>
+              <w:spacing w:after="40" w:lineRule="auto"/>
+            </w:pPr>
+            <w:r>
+              <w:rPr>
+                <w:rFonts w:ascii="Calibri" w:cs="Calibri" w:eastAsia="Calibri" w:hAnsi="Calibri"/>
+                <w:sz w:val="18"/>
+                <w:szCs w:val="18"/>
+              </w:rPr>
+              <w:t xml:space="preserve"/>
+            </w:r>
+          </w:p>
+        </w:tc>
+        <w:tc>
+          <w:tcPr>
+            <w:tcW w:w="2725" w:type="dxa"/>
+          </w:tcPr>
+          <w:p>
+            <w:pPr>
+              <w:spacing w:after="40" w:lineRule="auto"/>
+            </w:pPr>
+            <w:r>
+              <w:rPr>
+                <w:rFonts w:ascii="Calibri" w:cs="Calibri" w:eastAsia="Calibri" w:hAnsi="Calibri"/>
+                <w:sz w:val="18"/>
+                <w:szCs w:val="18"/>
+              </w:rPr>
+              <w:t xml:space="preserve"/>
+            </w:r>
+          </w:p>
+        </w:tc>
+      </w:tr>
+      <w:tr>
+        <w:trPr>
+          <w:cantSplit/>
+        </w:trPr>
+        <w:tc>
+          <w:tcPr>
+            <w:tcW w:w="800" w:type="dxa"/>
+          </w:tcPr>
+          <w:p>
+            <w:pPr>
+              <w:spacing w:after="40" w:lineRule="auto"/>
+            </w:pPr>
+            <w:r>
+              <w:rPr>
+                <w:rFonts w:ascii="Calibri" w:cs="Calibri" w:eastAsia="Calibri" w:hAnsi="Calibri"/>
+                <w:sz w:val="18"/>
+                <w:szCs w:val="18"/>
+              </w:rPr>
+              <w:t xml:space="preserve">T6</w:t>
+            </w:r>
+          </w:p>
+        </w:tc>
+        <w:tc>
+          <w:tcPr>
+            <w:tcW w:w="1800" w:type="dxa"/>
+          </w:tcPr>
+          <w:p>
+            <w:pPr>
+              <w:spacing w:after="40" w:lineRule="auto"/>
+            </w:pPr>
+            <w:r>
+              <w:rPr>
+                <w:rFonts w:ascii="Calibri" w:cs="Calibri" w:eastAsia="Calibri" w:hAnsi="Calibri"/>
+                <w:sz w:val="18"/>
+                <w:szCs w:val="18"/>
+              </w:rPr>
+              <w:t xml:space="preserve"/>
+            </w:r>
+          </w:p>
+        </w:tc>
+        <w:tc>
+          <w:tcPr>
+            <w:tcW w:w="1300" w:type="dxa"/>
+          </w:tcPr>
+          <w:p>
+            <w:pPr>
+              <w:spacing w:after="40" w:lineRule="auto"/>
+            </w:pPr>
+            <w:r>
+              <w:rPr>
+                <w:rFonts w:ascii="Calibri" w:cs="Calibri" w:eastAsia="Calibri" w:hAnsi="Calibri"/>
+                <w:sz w:val="18"/>
+                <w:szCs w:val="18"/>
+              </w:rPr>
+              <w:t xml:space="preserve"/>
+            </w:r>
+          </w:p>
+        </w:tc>
+        <w:tc>
+          <w:tcPr>
+            <w:tcW w:w="1300" w:type="dxa"/>
+          </w:tcPr>
+          <w:p>
+            <w:pPr>
+              <w:spacing w:after="40" w:lineRule="auto"/>
+            </w:pPr>
+            <w:r>
+              <w:rPr>
+                <w:rFonts w:ascii="Calibri" w:cs="Calibri" w:eastAsia="Calibri" w:hAnsi="Calibri"/>
+                <w:sz w:val="18"/>
+                <w:szCs w:val="18"/>
+              </w:rPr>
+              <w:t xml:space="preserve"/>
+            </w:r>
+          </w:p>
+        </w:tc>
+        <w:tc>
+          <w:tcPr>
+            <w:tcW w:w="1100" w:type="dxa"/>
+          </w:tcPr>
+          <w:p>
+            <w:pPr>
+              <w:spacing w:after="40" w:lineRule="auto"/>
+            </w:pPr>
+            <w:r>
+              <w:rPr>
+                <w:rFonts w:ascii="Calibri" w:cs="Calibri" w:eastAsia="Calibri" w:hAnsi="Calibri"/>
+                <w:sz w:val="18"/>
+                <w:szCs w:val="18"/>
+              </w:rPr>
+              <w:t xml:space="preserve"/>
+            </w:r>
+          </w:p>
+        </w:tc>
+        <w:tc>
+          <w:tcPr>
+            <w:tcW w:w="2725" w:type="dxa"/>
+          </w:tcPr>
+          <w:p>
+            <w:pPr>
+              <w:spacing w:after="40" w:lineRule="auto"/>
+            </w:pPr>
+            <w:r>
+              <w:rPr>
+                <w:rFonts w:ascii="Calibri" w:cs="Calibri" w:eastAsia="Calibri" w:hAnsi="Calibri"/>
+                <w:sz w:val="18"/>
+                <w:szCs w:val="18"/>
+              </w:rPr>
+              <w:t xml:space="preserve"/>
+            </w:r>
+          </w:p>
+        </w:tc>
+      </w:tr>
+      <w:tr>
+        <w:trPr>
+          <w:cantSplit/>
+        </w:trPr>
+        <w:tc>
+          <w:tcPr>
+            <w:tcW w:w="800" w:type="dxa"/>
+          </w:tcPr>
+          <w:p>
+            <w:pPr>
+              <w:spacing w:after="40" w:lineRule="auto"/>
+            </w:pPr>
+            <w:r>
+              <w:rPr>
+                <w:rFonts w:ascii="Calibri" w:cs="Calibri" w:eastAsia="Calibri" w:hAnsi="Calibri"/>
+                <w:sz w:val="18"/>
+                <w:szCs w:val="18"/>
+              </w:rPr>
+              <w:t xml:space="preserve">T7</w:t>
+            </w:r>
+          </w:p>
+        </w:tc>
+        <w:tc>
+          <w:tcPr>
+            <w:tcW w:w="1800" w:type="dxa"/>
+          </w:tcPr>
+          <w:p>
+            <w:pPr>
+              <w:spacing w:after="40" w:lineRule="auto"/>
+            </w:pPr>
+            <w:r>
+              <w:rPr>
+                <w:rFonts w:ascii="Calibri" w:cs="Calibri" w:eastAsia="Calibri" w:hAnsi="Calibri"/>
+                <w:sz w:val="18"/>
+                <w:szCs w:val="18"/>
+              </w:rPr>
+              <w:t xml:space="preserve"/>
+            </w:r>
+          </w:p>
+        </w:tc>
+        <w:tc>
+          <w:tcPr>
+            <w:tcW w:w="1300" w:type="dxa"/>
+          </w:tcPr>
+          <w:p>
+            <w:pPr>
+              <w:spacing w:after="40" w:lineRule="auto"/>
+            </w:pPr>
+            <w:r>
+              <w:rPr>
+                <w:rFonts w:ascii="Calibri" w:cs="Calibri" w:eastAsia="Calibri" w:hAnsi="Calibri"/>
+                <w:sz w:val="18"/>
+                <w:szCs w:val="18"/>
+              </w:rPr>
+              <w:t xml:space="preserve"/>
+            </w:r>
+          </w:p>
+        </w:tc>
+        <w:tc>
+          <w:tcPr>
+            <w:tcW w:w="1300" w:type="dxa"/>
+          </w:tcPr>
+          <w:p>
+            <w:pPr>
+              <w:spacing w:after="40" w:lineRule="auto"/>
+            </w:pPr>
+            <w:r>
+              <w:rPr>
+                <w:rFonts w:ascii="Calibri" w:cs="Calibri" w:eastAsia="Calibri" w:hAnsi="Calibri"/>
+                <w:sz w:val="18"/>
+                <w:szCs w:val="18"/>
+              </w:rPr>
+              <w:t xml:space="preserve"/>
+            </w:r>
+          </w:p>
+        </w:tc>
+        <w:tc>
+          <w:tcPr>
+            <w:tcW w:w="1100" w:type="dxa"/>
+          </w:tcPr>
+          <w:p>
+            <w:pPr>
+              <w:spacing w:after="40" w:lineRule="auto"/>
+            </w:pPr>
+            <w:r>
+              <w:rPr>
+                <w:rFonts w:ascii="Calibri" w:cs="Calibri" w:eastAsia="Calibri" w:hAnsi="Calibri"/>
+                <w:sz w:val="18"/>
+                <w:szCs w:val="18"/>
+              </w:rPr>
+              <w:t xml:space="preserve"/>
+            </w:r>
+          </w:p>
+        </w:tc>
+        <w:tc>
+          <w:tcPr>
+            <w:tcW w:w="2725" w:type="dxa"/>
+          </w:tcPr>
+          <w:p>
+            <w:pPr>
+              <w:spacing w:after="40" w:lineRule="auto"/>
+            </w:pPr>
+            <w:r>
+              <w:rPr>
+                <w:rFonts w:ascii="Calibri" w:cs="Calibri" w:eastAsia="Calibri" w:hAnsi="Calibri"/>
+                <w:sz w:val="18"/>
+                <w:szCs w:val="18"/>
+              </w:rPr>
+              <w:t xml:space="preserve"/>
+            </w:r>
+          </w:p>
+        </w:tc>
+      </w:tr>
+    </w:tbl>
+    <w:p>
+      <w:pPr>
+        <w:spacing w:after="120" w:lineRule="auto"/>
+      </w:pPr>
+      <w:r>
+        <w:rPr>
+          <w:rFonts w:ascii="Calibri" w:cs="Calibri" w:eastAsia="Calibri" w:hAnsi="Calibri"/>
+        </w:rPr>
+        <w:t xml:space="preserve"/>
+      </w:r>
+    </w:p>
+    <w:p>
+      <w:pPr>
+        <w:spacing w:after="200" w:lineRule="auto"/>
+      </w:pPr>
+      <w:r>
+        <w:rPr>
+          <w:rFonts w:ascii="Calibri" w:cs="Calibri" w:eastAsia="Calibri" w:hAnsi="Calibri"/>
+          <w:i w:val="1"/>
+          <w:iCs w:val="1"/>
+        </w:rPr>
+        <w:t xml:space="preserve">Conclusiones y mejoras derivadas: [completar después de ejecutar la prueba].</w:t>
       </w:r>
     </w:p>
     <w:p>

</xml_diff>